<commit_message>
Author block: School of Engineering and Natural Sciences + grouped emails
Match the requested institutional format: plain author names (no
student/advisor footnote marks), single affiliation line "School of
Engineering and Natural Sciences, Istanbul Medipol University,
Istanbul, Turkey", and brace-grouped student emails. Applied to md,
LaTeX, and the regenerated DOCX.
</commit_message>
<xml_diff>
--- a/paper/INISTA_Paper.docx
+++ b/paper/INISTA_Paper.docx
@@ -28,7 +28,7 @@
           <w:rFonts w:ascii="Times New Roman" w:hAnsi="Times New Roman"/>
           <w:sz w:val="24"/>
         </w:rPr>
-        <w:t>Hakan Sabuniş*, Yusuf Ünlü*, Selim Akyokuş†</w:t>
+        <w:t>Hakan Sabuniş, Yusuf Ünlü, and Selim Akyokuş</w:t>
       </w:r>
     </w:p>
     <w:p>
@@ -42,7 +42,7 @@
           <w:rFonts w:ascii="Times New Roman" w:hAnsi="Times New Roman"/>
           <w:sz w:val="20"/>
         </w:rPr>
-        <w:t>*Dept. of Computer Engineering, †Dept. of Computer Engineering (Advisor), Istanbul Medipol University, Istanbul, Türkiye</w:t>
+        <w:t>School of Engineering and Natural Sciences, Istanbul Medipol University, Istanbul, Turkey</w:t>
       </w:r>
     </w:p>
     <w:p>
@@ -57,7 +57,7 @@
           <w:i/>
           <w:sz w:val="20"/>
         </w:rPr>
-        <w:t>hakan.sabunis@std.medipol.edu.tr, yusuf.unlu@std.medipol.edu.tr, sakyokus@medipol.edu.tr</w:t>
+        <w:t>{hakan.sabunis, yusuf.unlu}@std.medipol.edu.tr, sakyokus@medipol.edu.tr</w:t>
       </w:r>
     </w:p>
     <w:p>

</xml_diff>

<commit_message>
Figure 1: replace product architecture with the contract-flow diagram
Reviewers asked the figure to mark the load-bearing boundary — where
the enums are generated from the evidence (Tier A) and where the
deterministic verification happens (Tier B). New vector figure
(matplotlib -> contract_flow.pdf for LaTeX, PNG for DOCX): evidence
producer -> evidence E (A_E, V_E, anchor) -> call-time enum binding ->
narrator -> Tier B checks (entity / value / completeness) with the
corrective-retry loop, strip/flag fallback, and the validated-output
path to the user. Grayscale, column-width, IEEE-print friendly.
Generator script included; captions updated in md + LaTeX; DOCX
regenerated with the new figure embedded.
</commit_message>
<xml_diff>
--- a/paper/INISTA_Paper.docx
+++ b/paper/INISTA_Paper.docx
@@ -992,7 +992,7 @@
       <w:r>
         <w:drawing>
           <wp:inline xmlns:a="http://schemas.openxmlformats.org/drawingml/2006/main" xmlns:pic="http://schemas.openxmlformats.org/drawingml/2006/picture">
-            <wp:extent cx="3017520" cy="2254300"/>
+            <wp:extent cx="3017520" cy="3104984"/>
             <wp:docPr id="1" name="Picture 1"/>
             <wp:cNvGraphicFramePr>
               <a:graphicFrameLocks noChangeAspect="1"/>
@@ -1001,7 +1001,7 @@
               <a:graphicData uri="http://schemas.openxmlformats.org/drawingml/2006/picture">
                 <pic:pic>
                   <pic:nvPicPr>
-                    <pic:cNvPr id="0" name="architecture.png"/>
+                    <pic:cNvPr id="0" name="contract_flow.png"/>
                     <pic:cNvPicPr/>
                   </pic:nvPicPr>
                   <pic:blipFill>
@@ -1013,7 +1013,7 @@
                   <pic:spPr>
                     <a:xfrm>
                       <a:off x="0" y="0"/>
-                      <a:ext cx="3017520" cy="2254300"/>
+                      <a:ext cx="3017520" cy="3104984"/>
                     </a:xfrm>
                     <a:prstGeom prst="rect"/>
                   </pic:spPr>
@@ -1035,7 +1035,7 @@
           <w:rFonts w:ascii="Times New Roman" w:hAnsi="Times New Roman"/>
           <w:sz w:val="18"/>
         </w:rPr>
-        <w:t>Fig. 1. System architecture. Surfaces over a two-layer brain (deterministic tools + optional LLM narrator) over persistent context. The evidence-bound schema is generated at the tool→narrator boundary; the narrator's entities and claims are verified against the evidence before reaching the user.</w:t>
+        <w:t>Fig. 1. The evidence-bound contract. The deterministic layer emits the evidence dictionary E; Tier A binds the tool-schema enums to E at call time; Tier B deterministically verifies entity soundness, claim values, and completeness, with corrective retry, residual stripping, and omission flagging. Only validated citations and verified claims reach the user.</w:t>
       </w:r>
     </w:p>
     <w:p>

</xml_diff>

<commit_message>
Figure 1: trust-boundary block diagram (final)
Replace the vertical contract-flow chart with the trust-boundary block
diagram: a dashed contract boundary separates the deterministic side
(evidence producer, evidence E, Tier B verifier, all plain code) from
the untrusted LLM narrator; every arrow crossing the boundary is a
contract tier (Tier A enum binding inbound, submit_investigation
output and the corrective-retry loop outbound/back). Geometry now
states the paper's thesis: nothing crosses the boundary unchecked.
Verified character-by-character (V_E appears once; no stray layout
words). Captions updated in md + LaTeX with the trust-boundary
sentence; DOCX regenerated. The matplotlib flow version stays in the
repo as fallback.
</commit_message>
<xml_diff>
--- a/paper/INISTA_Paper.docx
+++ b/paper/INISTA_Paper.docx
@@ -992,7 +992,7 @@
       <w:r>
         <w:drawing>
           <wp:inline xmlns:a="http://schemas.openxmlformats.org/drawingml/2006/main" xmlns:pic="http://schemas.openxmlformats.org/drawingml/2006/picture">
-            <wp:extent cx="3017520" cy="3104984"/>
+            <wp:extent cx="3017520" cy="1647259"/>
             <wp:docPr id="1" name="Picture 1"/>
             <wp:cNvGraphicFramePr>
               <a:graphicFrameLocks noChangeAspect="1"/>
@@ -1001,7 +1001,7 @@
               <a:graphicData uri="http://schemas.openxmlformats.org/drawingml/2006/picture">
                 <pic:pic>
                   <pic:nvPicPr>
-                    <pic:cNvPr id="0" name="contract_flow.png"/>
+                    <pic:cNvPr id="0" name="contract_boundary.png"/>
                     <pic:cNvPicPr/>
                   </pic:nvPicPr>
                   <pic:blipFill>
@@ -1013,7 +1013,7 @@
                   <pic:spPr>
                     <a:xfrm>
                       <a:off x="0" y="0"/>
-                      <a:ext cx="3017520" cy="3104984"/>
+                      <a:ext cx="3017520" cy="1647259"/>
                     </a:xfrm>
                     <a:prstGeom prst="rect"/>
                   </pic:spPr>
@@ -1035,7 +1035,7 @@
           <w:rFonts w:ascii="Times New Roman" w:hAnsi="Times New Roman"/>
           <w:sz w:val="18"/>
         </w:rPr>
-        <w:t>Fig. 1. The evidence-bound contract. The deterministic layer emits the evidence dictionary E; Tier A binds the tool-schema enums to E at call time; Tier B deterministically verifies entity soundness, claim values, and completeness, with corrective retry, residual stripping, and omission flagging. Only validated citations and verified claims reach the user.</w:t>
+        <w:t>Fig. 1. The evidence-bound contract. The dashed line marks the trust boundary between the deterministic side (plain code, trusted) and the LLM narrator (untrusted). The deterministic layer emits the evidence dictionary E; Tier A binds the tool-schema enums to E at call time; Tier B deterministically verifies entity soundness, claim values, and completeness, with corrective retry, residual stripping, and omission flagging. Only validated citations and verified claims reach the user.</w:t>
       </w:r>
     </w:p>
     <w:p>

</xml_diff>

<commit_message>
Sec III-B rewritten to narrate the trust-boundary figure
The old subsection described the product's three-layer architecture
and pointed at Fig. 1, which now shows the trust-boundary contract —
a figure/text mismatch. The subsection (retitled "Architecture and
the Trust Boundary") now walks the reader through the figure: the
dashed boundary, the untrusted narrator, the three boundary-crossing
arrows as contract tiers ("nothing crosses unchecked"), then situates
the boundary inside the larger mlcompass system (surfaces, persistent
context, single deterministic backend) in two sentences. DOCX
regenerated.
</commit_message>
<xml_diff>
--- a/paper/INISTA_Paper.docx
+++ b/paper/INISTA_Paper.docx
@@ -967,7 +967,7 @@
           <w:i/>
           <w:sz w:val="20"/>
         </w:rPr>
-        <w:t>B. System Architecture</w:t>
+        <w:t>B. Architecture and the Trust Boundary</w:t>
       </w:r>
     </w:p>
     <w:p>
@@ -981,7 +981,81 @@
           <w:rFonts w:ascii="Times New Roman" w:hAnsi="Times New Roman"/>
           <w:sz w:val="20"/>
         </w:rPr>
-        <w:t>mlcompass is organized into three layers (Fig. 1): user-facing surfaces (a CLI, a tool-integration server [7], an autonomous agent, and editor slash commands) routing to one deterministic backend; a strictly split two-layer brain (a pure-Python deterministic evidence layer whose output is always a structured dictionary, plus an optional LLM narrator over it); and a persistent project-context folder. Because the evidence layer is deterministic and offline, every command works without the narrator; the narrator adds explanation, and the contract makes that explanation safe.</w:t>
+        <w:t xml:space="preserve">Fig. 1 shows the architecture as the contract sees it. A dashed trust boundary separates the </w:t>
+      </w:r>
+      <w:r>
+        <w:rPr>
+          <w:rFonts w:ascii="Times New Roman" w:hAnsi="Times New Roman"/>
+          <w:i/>
+          <w:sz w:val="20"/>
+        </w:rPr>
+        <w:t>deterministic side</w:t>
+      </w:r>
+      <w:r>
+        <w:rPr>
+          <w:rFonts w:ascii="Times New Roman" w:hAnsi="Times New Roman"/>
+          <w:sz w:val="20"/>
+        </w:rPr>
+        <w:t xml:space="preserve"> (the pure-Python evidence producer, the evidence dictionary </w:t>
+      </w:r>
+      <w:r>
+        <w:rPr>
+          <w:rFonts w:ascii="Times New Roman" w:hAnsi="Times New Roman"/>
+          <w:i/>
+          <w:sz w:val="20"/>
+        </w:rPr>
+        <w:t>E</w:t>
+      </w:r>
+      <w:r>
+        <w:rPr>
+          <w:rFonts w:ascii="Times New Roman" w:hAnsi="Times New Roman"/>
+          <w:sz w:val="20"/>
+        </w:rPr>
+        <w:t xml:space="preserve">, the Tier B verifier, and the user-facing output, all plain code) from the </w:t>
+      </w:r>
+      <w:r>
+        <w:rPr>
+          <w:rFonts w:ascii="Times New Roman" w:hAnsi="Times New Roman"/>
+          <w:i/>
+          <w:sz w:val="20"/>
+        </w:rPr>
+        <w:t>LLM narrator</w:t>
+      </w:r>
+      <w:r>
+        <w:rPr>
+          <w:rFonts w:ascii="Times New Roman" w:hAnsi="Times New Roman"/>
+          <w:sz w:val="20"/>
+        </w:rPr>
+        <w:t xml:space="preserve">, which we treat as untrusted regardless of provider. Every arrow that crosses the boundary belongs to the contract: outbound, Tier A binds the tool-schema enums to </w:t>
+      </w:r>
+      <w:r>
+        <w:rPr>
+          <w:rFonts w:ascii="Times New Roman" w:hAnsi="Times New Roman"/>
+          <w:i/>
+          <w:sz w:val="20"/>
+        </w:rPr>
+        <w:t>E</w:t>
+      </w:r>
+      <w:r>
+        <w:rPr>
+          <w:rFonts w:ascii="Times New Roman" w:hAnsi="Times New Roman"/>
+          <w:sz w:val="20"/>
+        </w:rPr>
+        <w:t xml:space="preserve"> at call time; inbound, the narrator's </w:t>
+      </w:r>
+      <w:r>
+        <w:rPr>
+          <w:rFonts w:ascii="Consolas" w:hAnsi="Consolas"/>
+          <w:sz w:val="18"/>
+        </w:rPr>
+        <w:t>submit_investigation</w:t>
+      </w:r>
+      <w:r>
+        <w:rPr>
+          <w:rFonts w:ascii="Times New Roman" w:hAnsi="Times New Roman"/>
+          <w:sz w:val="20"/>
+        </w:rPr>
+        <w:t xml:space="preserve"> output enters only through Tier B verification; on a violation, the corrective retry re-crosses the boundary with the offending items named. Nothing crosses unchecked. Inside mlcompass this boundary sits within a larger system: eleven pipeline tools exposed through a CLI, a tool-integration server [7], an autonomous agent, and editor slash commands, over a persistent project-context folder. Every surface routes through the same deterministic backend, so the contract guards the only path by which narrator output reaches a user. Because the evidence layer is deterministic and offline, every command also works without the narrator; the narrator adds explanation, and the contract makes that explanation safe.</w:t>
       </w:r>
     </w:p>
     <w:p>

</xml_diff>

<commit_message>
Paper: full prose rewrite in the authors' voice
- Abstract, intro, related work, architecture, experiments and discussion
  rewritten sentence-by-sentence: varied rhythm, fewer semicolon chains,
  plain verbs; all numbers, citations, tables, definitions and
  propositions preserved verbatim
- IEEE-compliant AI-assistance acknowledgment added (md + tex)
- Fix stale claim: test count 22 -> 23 (post-strip recheck test)
- Fix Setup/Results contradiction: setup now points at the diagnostic
  arms that DO isolate the tiers (Sec. IV-C), label sec:results added
- DOCX regenerated
</commit_message>
<xml_diff>
--- a/paper/INISTA_Paper.docx
+++ b/paper/INISTA_Paper.docx
@@ -90,7 +90,7 @@
           <w:rFonts w:ascii="Times New Roman" w:hAnsi="Times New Roman"/>
           <w:sz w:val="20"/>
         </w:rPr>
-        <w:t xml:space="preserve">Large language model (LLM) agents increasingly narrate the structured output of deterministic tools for human operators, and they fabricate: they cite columns, defects, or numbers that are absent from, or contradict, the upstream evidence. We observe that such narration is </w:t>
+        <w:t xml:space="preserve">LLM agents increasingly explain what deterministic tools have measured, and the explanations are not reliable: the agent will cite columns, defects, or numbers that are absent from the upstream evidence or contradict it. Our starting point is that this setting is easier than hallucination in general. What the narrator may cite is finite and machine-enumerable at call time, a property we call </w:t>
       </w:r>
       <w:r>
         <w:rPr>
@@ -105,7 +105,7 @@
           <w:rFonts w:ascii="Times New Roman" w:hAnsi="Times New Roman"/>
           <w:sz w:val="20"/>
         </w:rPr>
-        <w:t xml:space="preserve">: the citable entities and verifiable quantities are finite and machine-enumerable at call time, so faithfulness checking is decidable and fabrication can be prevented by construction rather than statistically mitigated. We present a two-tier </w:t>
+        <w:t xml:space="preserve">; faithfulness can therefore be checked exactly rather than estimated, and fabrication can be prevented outright instead of statistically reduced. We build the check into a two-tier </w:t>
       </w:r>
       <w:r>
         <w:rPr>
@@ -120,7 +120,7 @@
           <w:rFonts w:ascii="Times New Roman" w:hAnsi="Times New Roman"/>
           <w:sz w:val="20"/>
         </w:rPr>
-        <w:t xml:space="preserve">: tool-input </w:t>
+        <w:t xml:space="preserve">. Tier A generates the </w:t>
       </w:r>
       <w:r>
         <w:rPr>
@@ -134,7 +134,7 @@
           <w:rFonts w:ascii="Times New Roman" w:hAnsi="Times New Roman"/>
           <w:sz w:val="20"/>
         </w:rPr>
-        <w:t xml:space="preserve"> domains are generated from the evidence at call time, and the returned answer is deterministically verified for entity soundness, claim-value soundness, and completeness, with corrective retry, stripping, and flagging, independent of provider schema enforcement. We record two load-bearing formal observations: verification is linear-time, and soundness is safely repairable by deletion while completeness is not. Live measurements (N = 200 per cell) make the case: across six rule-free paraphrases of one instruction, the bare narrator's fabrication rate on identical evidence spanned 1%–100%, while the contract held the user-facing rate at 0/200 on all three verified channels of a synthetic and a real-data leakage task; under stress the verifier caught 76 live violations, passed none to the user, and one corrective message cut repeat violations from 37.5% to 1.3%. The contract ships in the production narrator of mlcompass, an open-source ML-pipeline assistant.</w:t>
+        <w:t xml:space="preserve"> domains of the tool-input schema from the evidence at call time. Tier B re-verifies the returned answer in plain code (entity soundness, claim-value soundness, completeness) with corrective retry, stripping, and flagging, and needs no trust in provider schema enforcement. Two short formal observations carry the design: verification is linear-time, and deletion repairs soundness safely while no safe repair exists for completeness. Live measurements (N = 200 per cell) back this up. Across six rule-free paraphrases of one instruction, the bare narrator fabricated on identical evidence at rates from 1% to 100%; the contract held the user-facing rate at 0/200 on all three channels of a synthetic and a real-data leakage task; under stress the verifier caught 76 live violations, passed none through, and one corrective message cut repeat violations from 37.5% to 1.3%. The contract ships in the production narrator of mlcompass, an open-source ML-pipeline assistant.</w:t>
       </w:r>
     </w:p>
     <w:p>
@@ -187,22 +187,7 @@
           <w:rFonts w:ascii="Times New Roman" w:hAnsi="Times New Roman"/>
           <w:sz w:val="20"/>
         </w:rPr>
-        <w:t xml:space="preserve">Modern machine-learning engineering is supported by a fragmented ecosystem of single-purpose tools: profiling libraries for dataset inspection [13], experiment trackers for training [14], [15], automated model search for selection [16]. Each covers one slice of the pipeline; none gives end-to-end advice. A natural response is to place a large language model (LLM) on top as an advisory layer: an </w:t>
-      </w:r>
-      <w:r>
-        <w:rPr>
-          <w:rFonts w:ascii="Times New Roman" w:hAnsi="Times New Roman"/>
-          <w:i/>
-          <w:sz w:val="20"/>
-        </w:rPr>
-        <w:t>agent</w:t>
-      </w:r>
-      <w:r>
-        <w:rPr>
-          <w:rFonts w:ascii="Times New Roman" w:hAnsi="Times New Roman"/>
-          <w:sz w:val="20"/>
-        </w:rPr>
-        <w:t xml:space="preserve"> that calls these tools, reads their structured output, and explains it to the engineer, in the agentic pattern formalized by ReAct [5] and Toolformer [6] and operationalized by tool-integration standards [7].</w:t>
+        <w:t>Machine-learning practice runs on a patchwork of single-purpose tools. A profiling library inspects the dataset [13], experiment trackers log training runs [14], [15], and automated model search picks an estimator [16]. Each does one job well. None of them tells the engineer what the results mean, and the now-standard answer to that gap is agentic: put a large language model (LLM) on top, let it call the tools, read their structured output, and explain, following the pattern formalized by ReAct [5] and Toolformer [6] and operationalized by tool-integration standards [7].</w:t>
       </w:r>
     </w:p>
     <w:p>
@@ -216,7 +201,7 @@
           <w:rFonts w:ascii="Times New Roman" w:hAnsi="Times New Roman"/>
           <w:sz w:val="20"/>
         </w:rPr>
-        <w:t xml:space="preserve">The pattern has a well-documented hazard: LLMs hallucinate [1], [2]. Code assistants built on the same foundation models [3] still fail on real software tasks at substantial rates [4]. In an advisory ML setting the danger is specific. When the narrated object is </w:t>
+        <w:t xml:space="preserve">The trouble is that LLMs hallucinate [1], [2], and assistants built on the same foundation models [3] still fail real software tasks at substantial rates [4]. In an advisory ML setting the failure takes a specific form. The narrated object is </w:t>
       </w:r>
       <w:r>
         <w:rPr>
@@ -231,7 +216,7 @@
           <w:rFonts w:ascii="Times New Roman" w:hAnsi="Times New Roman"/>
           <w:sz w:val="20"/>
         </w:rPr>
-        <w:t xml:space="preserve">, a dictionary of measured facts produced by a deterministic tool, the agent can introduce what we call </w:t>
+        <w:t xml:space="preserve">, a dictionary of facts that a deterministic tool actually measured, and the narrator can invent members of it: a column the data does not contain, a defect nobody detected, a number that contradicts the report. We call this </w:t>
       </w:r>
       <w:r>
         <w:rPr>
@@ -246,7 +231,7 @@
           <w:rFonts w:ascii="Times New Roman" w:hAnsi="Times New Roman"/>
           <w:sz w:val="20"/>
         </w:rPr>
-        <w:t xml:space="preserve">: it names a column, a defect, a remedy, or a number that is </w:t>
+        <w:t xml:space="preserve">. In the taxonomy of Ji </w:t>
       </w:r>
       <w:r>
         <w:rPr>
@@ -254,29 +239,14 @@
           <w:i/>
           <w:sz w:val="20"/>
         </w:rPr>
-        <w:t>not present in</w:t>
+        <w:t>et al.</w:t>
       </w:r>
       <w:r>
         <w:rPr>
           <w:rFonts w:ascii="Times New Roman" w:hAnsi="Times New Roman"/>
           <w:sz w:val="20"/>
         </w:rPr>
-        <w:t xml:space="preserve"> (or contradicts) that evidence. In the taxonomy of Ji </w:t>
-      </w:r>
-      <w:r>
-        <w:rPr>
-          <w:rFonts w:ascii="Times New Roman" w:hAnsi="Times New Roman"/>
-          <w:i/>
-          <w:sz w:val="20"/>
-        </w:rPr>
-        <w:t>et al.</w:t>
-      </w:r>
-      <w:r>
-        <w:rPr>
-          <w:rFonts w:ascii="Times New Roman" w:hAnsi="Times New Roman"/>
-          <w:sz w:val="20"/>
-        </w:rPr>
-        <w:t xml:space="preserve"> [1] this is a closed-world faithfulness failure (extrinsic when an entity is invented, intrinsic when a quantity contradicts the source) over a source that is fully enumerable. A fabricated diagnosis delivered with fluent confidence is worse than no diagnosis, because the practitioner acts on it.</w:t>
+        <w:t xml:space="preserve"> [1] it is a closed-world faithfulness failure, extrinsic when an entity is invented and intrinsic when a quantity contradicts the source, but the source here happens to be fully enumerable. The cost is concrete. A wrong diagnosis delivered fluently is worse than no diagnosis, because the practitioner acts on it.</w:t>
       </w:r>
     </w:p>
     <w:p>
@@ -290,7 +260,7 @@
           <w:rFonts w:ascii="Times New Roman" w:hAnsi="Times New Roman"/>
           <w:sz w:val="20"/>
         </w:rPr>
-        <w:t xml:space="preserve">Our starting observation is that this setting has structure the general hallucination problem lacks. </w:t>
+        <w:t xml:space="preserve">That enumerability is what this paper is built on. </w:t>
       </w:r>
       <w:r>
         <w:rPr>
@@ -320,7 +290,7 @@
           <w:rFonts w:ascii="Times New Roman" w:hAnsi="Times New Roman"/>
           <w:sz w:val="20"/>
         </w:rPr>
-        <w:t xml:space="preserve"> For evidence-closed tasks, faithfulness checking is </w:t>
+        <w:t xml:space="preserve"> Once a task is evidence-closed, faithfulness checking stops being a modeling problem. Entity citations are set-membership tests, quantitative claims are numeric comparisons, and coverage of the critical finding is one more membership test. The check is </w:t>
       </w:r>
       <w:r>
         <w:rPr>
@@ -335,7 +305,7 @@
           <w:rFonts w:ascii="Times New Roman" w:hAnsi="Times New Roman"/>
           <w:sz w:val="20"/>
         </w:rPr>
-        <w:t xml:space="preserve">: entity citations reduce to set membership, quantitative claims to numeric comparison, coverage of critical evidence to anchor checking. Decidability changes the goal from </w:t>
+        <w:t xml:space="preserve">, which changes the sensible goal from </w:t>
       </w:r>
       <w:r>
         <w:rPr>
@@ -350,7 +320,7 @@
           <w:rFonts w:ascii="Times New Roman" w:hAnsi="Times New Roman"/>
           <w:sz w:val="20"/>
         </w:rPr>
-        <w:t xml:space="preserve"> (lowering a fabrication probability) to </w:t>
+        <w:t xml:space="preserve">, pushing a fabrication probability down, to </w:t>
       </w:r>
       <w:r>
         <w:rPr>
@@ -365,7 +335,7 @@
           <w:rFonts w:ascii="Times New Roman" w:hAnsi="Times New Roman"/>
           <w:sz w:val="20"/>
         </w:rPr>
-        <w:t xml:space="preserve"> (making unfaithful output unreturnable).</w:t>
+        <w:t>, making an unfaithful answer impossible to return.</w:t>
       </w:r>
     </w:p>
     <w:p>
@@ -379,37 +349,7 @@
           <w:rFonts w:ascii="Times New Roman" w:hAnsi="Times New Roman"/>
           <w:sz w:val="20"/>
         </w:rPr>
-        <w:t xml:space="preserve">A natural starting point is </w:t>
-      </w:r>
-      <w:r>
-        <w:rPr>
-          <w:rFonts w:ascii="Times New Roman" w:hAnsi="Times New Roman"/>
-          <w:i/>
-          <w:sz w:val="20"/>
-        </w:rPr>
-        <w:t>constrained generation</w:t>
-      </w:r>
-      <w:r>
-        <w:rPr>
-          <w:rFonts w:ascii="Times New Roman" w:hAnsi="Times New Roman"/>
-          <w:sz w:val="20"/>
-        </w:rPr>
-        <w:t xml:space="preserve">: Outlines [8], LMQL [9], grammar-constrained decoding [10], and Guidance [11] enforce a grammar or schema during decoding, and provider tool-use APIs validate calls against a declared JSON schema [12]. These mechanisms can be driven by </w:t>
-      </w:r>
-      <w:r>
-        <w:rPr>
-          <w:rFonts w:ascii="Times New Roman" w:hAnsi="Times New Roman"/>
-          <w:i/>
-          <w:sz w:val="20"/>
-        </w:rPr>
-        <w:t>input-dependent</w:t>
-      </w:r>
-      <w:r>
-        <w:rPr>
-          <w:rFonts w:ascii="Times New Roman" w:hAnsi="Times New Roman"/>
-          <w:sz w:val="20"/>
-        </w:rPr>
-        <w:t xml:space="preserve"> grammars [10] and per-request schemas. Two gaps remain. First, decoding-time enforcement requires access to the model's token distribution, which commercial APIs do not expose. Second, even a per-call schema offers no guarantee unless the provider's enforcement is trusted, which, for a safety claim, it should not be.</w:t>
+        <w:t>Constrained generation looks like the natural tool for this. Outlines [8], LMQL [9], grammar-constrained decoding [10], and Guidance [11] restrict what a model may emit during decoding, and provider tool-use APIs validate calls against a declared JSON schema [12]. Input-dependent grammars exist too [10]. Two things still go wrong in our setting. Decoding-time enforcement needs access to the token distribution, and commercial APIs do not expose it. A per-call schema, in turn, only helps if the provider's enforcement is trusted, and for a safety claim it should not be.</w:t>
       </w:r>
     </w:p>
     <w:p>
@@ -423,7 +363,7 @@
           <w:rFonts w:ascii="Times New Roman" w:hAnsi="Times New Roman"/>
           <w:sz w:val="20"/>
         </w:rPr>
-        <w:t xml:space="preserve">We close these gaps with a two-tier </w:t>
+        <w:t xml:space="preserve">Our answer is a two-tier </w:t>
       </w:r>
       <w:r>
         <w:rPr>
@@ -446,14 +386,14 @@
           <w:i/>
           <w:sz w:val="20"/>
         </w:rPr>
-        <w:t>Tier A (constrained generation):</w:t>
+        <w:t>Tier A</w:t>
       </w:r>
       <w:r>
         <w:rPr>
           <w:rFonts w:ascii="Times New Roman" w:hAnsi="Times New Roman"/>
           <w:sz w:val="20"/>
         </w:rPr>
-        <w:t xml:space="preserve"> the </w:t>
+        <w:t xml:space="preserve"> generates the </w:t>
       </w:r>
       <w:r>
         <w:rPr>
@@ -467,7 +407,7 @@
           <w:rFonts w:ascii="Times New Roman" w:hAnsi="Times New Roman"/>
           <w:sz w:val="20"/>
         </w:rPr>
-        <w:t xml:space="preserve"> domains of the narrator's tool-input fields are generated at call time from the deterministic evidence dictionary. </w:t>
+        <w:t xml:space="preserve"> domains of the narrator's tool-input fields from the deterministic evidence dictionary at call time, which constrains generation as far as a closed API allows. </w:t>
       </w:r>
       <w:r>
         <w:rPr>
@@ -475,14 +415,14 @@
           <w:i/>
           <w:sz w:val="20"/>
         </w:rPr>
-        <w:t>Tier B (deterministic verification):</w:t>
+        <w:t>Tier B</w:t>
       </w:r>
       <w:r>
         <w:rPr>
           <w:rFonts w:ascii="Times New Roman" w:hAnsi="Times New Roman"/>
           <w:sz w:val="20"/>
         </w:rPr>
-        <w:t xml:space="preserve"> the returned answer is checked in plain code on three channels: entity soundness, value soundness of structured </w:t>
+        <w:t xml:space="preserve"> takes over where trust ends. Plain code re-checks the returned answer on three channels: entity soundness; value soundness of structured </w:t>
       </w:r>
       <w:r>
         <w:rPr>
@@ -496,7 +436,7 @@
           <w:rFonts w:ascii="Times New Roman" w:hAnsi="Times New Roman"/>
           <w:sz w:val="20"/>
         </w:rPr>
-        <w:t xml:space="preserve"> claims (within a small tolerance so honest rounding passes), and completeness with respect to the top-ranked candidate. Violations trigger a corrective retry; after the budget, unsound entities and claims are stripped, and persistent omissions are flagged. The resulting guarantee holds independent of the provider: </w:t>
+        <w:t xml:space="preserve"> claims, with a small tolerance so honest rounding passes; and completeness with respect to the top-ranked candidate. A violation triggers a corrective retry. When the retry budget runs out, unsound entities and claims are stripped and a persistent omission is flagged. What survives is a guarantee that owes nothing to the provider: </w:t>
       </w:r>
       <w:r>
         <w:rPr>
@@ -511,7 +451,7 @@
           <w:rFonts w:ascii="Times New Roman" w:hAnsi="Times New Roman"/>
           <w:sz w:val="20"/>
         </w:rPr>
-        <w:t>; free-text narration sits outside the verified channels, and renderers surface the validated fields as the actionable output. The verification step is deliberately simple; that simplicity is what decidability buys (Sec. III-C formalizes this), and it is why the guarantee can be absolute where decoding-time methods cannot even be applied.</w:t>
+        <w:t>. Free-text narration sits outside these channels, and renderers surface the validated fields as the actionable output. None of the checks is sophisticated, and that is the point. Decidability is what makes such simple checks sufficient (Sec. III-C), and it is why the guarantee can be absolute in a place where decoding-time machinery cannot run at all.</w:t>
       </w:r>
     </w:p>
     <w:p>
@@ -525,7 +465,7 @@
           <w:rFonts w:ascii="Times New Roman" w:hAnsi="Times New Roman"/>
           <w:sz w:val="20"/>
         </w:rPr>
-        <w:t xml:space="preserve">We instantiate the contract in </w:t>
+        <w:t xml:space="preserve">The contract is not a prototype. It runs in the production narrator of </w:t>
       </w:r>
       <w:r>
         <w:rPr>
@@ -540,7 +480,7 @@
           <w:rFonts w:ascii="Times New Roman" w:hAnsi="Times New Roman"/>
           <w:sz w:val="20"/>
         </w:rPr>
-        <w:t>, an open-source (MIT) ML-pipeline assistant, in the production narrator triggered when a deterministic metric looks impossibly good (e.g., R² &gt; 0.999), the canonical signature of data leakage [17].</w:t>
+        <w:t>, an open-source (MIT) ML-pipeline assistant, guarding the investigation that fires when a metric looks too good to be true (e.g., R² &gt; 0.999), the classic signature of data leakage [17].</w:t>
       </w:r>
     </w:p>
     <w:p>
@@ -554,7 +494,7 @@
           <w:rFonts w:ascii="Times New Roman" w:hAnsi="Times New Roman"/>
           <w:sz w:val="20"/>
         </w:rPr>
-        <w:t>The paper makes three contributions:</w:t>
+        <w:t>Three contributions:</w:t>
       </w:r>
     </w:p>
     <w:p>
@@ -575,7 +515,7 @@
           <w:rFonts w:ascii="Times New Roman" w:hAnsi="Times New Roman"/>
           <w:sz w:val="20"/>
         </w:rPr>
-        <w:t xml:space="preserve">We define the </w:t>
+        <w:t xml:space="preserve">The </w:t>
       </w:r>
       <w:r>
         <w:rPr>
@@ -590,7 +530,7 @@
           <w:rFonts w:ascii="Times New Roman" w:hAnsi="Times New Roman"/>
           <w:sz w:val="20"/>
         </w:rPr>
-        <w:t xml:space="preserve"> class of narration tasks and establish its two load-bearing formal properties: faithfulness verification is linear-time (Prop. 1), and soundness is safely repairable by deletion while completeness is not (Prop. 2); this is the structural reason the contract strips unsound content but can only flag omissions (Sec. III-C).</w:t>
+        <w:t xml:space="preserve"> class of narration tasks, with the two formal facts the design rests on: faithfulness verification is linear-time (Prop. 1), and deletion repairs soundness safely while completeness admits no safe repair (Prop. 2). The second fact is the structural reason the contract strips unsound content but only flags omissions (Sec. III-C).</w:t>
       </w:r>
     </w:p>
     <w:p>
@@ -611,7 +551,7 @@
           <w:rFonts w:ascii="Times New Roman" w:hAnsi="Times New Roman"/>
           <w:sz w:val="20"/>
         </w:rPr>
-        <w:t>We measure the contract live on a synthetic and a real-data leakage task (N = 200 per cell, Wilson 95% CIs): bare narrators fabricate at 11.5% and 43.5%; the contract holds the user-facing rate at 0/200 on all three channels of both tasks; and in stress configurations the deterministic verifier demonstrably catches 80 live violations (76 on the real-data task) while passing none to the user; a pre-stated iid retry model is rejected in the informative direction: corrective feedback cuts repeat violations from 37.5% to 1.3% (Sec. IV).</w:t>
+        <w:t>Live measurements of the shipped contract on a synthetic and a real-data leakage task (N = 200 per cell, Wilson 95% CIs). Bare narrators fabricate at 11.5% and 43.5%; the contract held the user-facing rate at 0/200 on all three channels of both tasks; in stress configurations the verifier caught 80 live violations and passed none through; and a pre-stated iid retry model was rejected in the informative direction, with one corrective message cutting repeat violations from 37.5% to 1.3% (Sec. IV).</w:t>
       </w:r>
     </w:p>
     <w:p>
@@ -632,7 +572,7 @@
           <w:rFonts w:ascii="Times New Roman" w:hAnsi="Times New Roman"/>
           <w:sz w:val="20"/>
         </w:rPr>
-        <w:t>We show with a six-way paraphrase sweep that the bare narrator's fabrication rate on identical evidence ranges from 1% to 100% under rule-free rewording; prompt-level defenses are not certifiable, which is the empirical case for structural enforcement (Sec. IV-C).</w:t>
+        <w:t>A six-way paraphrase sweep in which the bare narrator's fabrication rate on identical evidence moves from 1% to 100% under rule-free rewording. We read this as the empirical case that prompt-level defenses cannot be certified (Sec. IV-C).</w:t>
       </w:r>
     </w:p>
     <w:p>
@@ -646,7 +586,7 @@
           <w:rFonts w:ascii="Times New Roman" w:hAnsi="Times New Roman"/>
           <w:sz w:val="20"/>
         </w:rPr>
-        <w:t>Section II reviews related work, Section III the system and contract, Section IV experiments, Section V discussion, Section VI conclusion.</w:t>
+        <w:t>Section II positions the contract against prior work, Section III describes the system and the formal observations, Section IV reports the measurements, Section V discusses what they show and where they stop, and Section VI concludes.</w:t>
       </w:r>
     </w:p>
     <w:p>
@@ -698,7 +638,7 @@
           <w:rFonts w:ascii="Times New Roman" w:hAnsi="Times New Roman"/>
           <w:sz w:val="20"/>
         </w:rPr>
-        <w:t xml:space="preserve"> [1] survey hallucination across generation tasks and distinguish intrinsic from extrinsic failures; Huang </w:t>
+        <w:t xml:space="preserve"> [1] survey hallucination across generation tasks and separate intrinsic from extrinsic failures; Huang </w:t>
       </w:r>
       <w:r>
         <w:rPr>
@@ -713,7 +653,7 @@
           <w:rFonts w:ascii="Times New Roman" w:hAnsi="Times New Roman"/>
           <w:sz w:val="20"/>
         </w:rPr>
-        <w:t xml:space="preserve"> [2] give an LLM-specific taxonomy. Phantom-entity fabrication is an extrinsic failure with special structure: the "source" is a finite, machine-enumerable evidence dictionary, making the faithfulness check decidable rather than open-world. Our work eliminates this decidable slice at the tool boundary.</w:t>
+        <w:t xml:space="preserve"> [2] give an LLM-specific taxonomy. Phantom-entity fabrication is extrinsic, but with structure the general problem lacks: the source is a finite, machine-enumerable dictionary, so the faithfulness check is decidable rather than open-world. We eliminate this decidable slice at the tool boundary and claim nothing beyond it.</w:t>
       </w:r>
     </w:p>
     <w:p>
@@ -735,7 +675,7 @@
           <w:rFonts w:ascii="Times New Roman" w:hAnsi="Times New Roman"/>
           <w:sz w:val="20"/>
         </w:rPr>
-        <w:t xml:space="preserve"> ReAct [5] interleaves reasoning with tool actions; Toolformer [6] shows models can learn when and how to call external APIs; tool-integration standards [7] let LLM clients discover and call third-party tools over a uniform protocol. These establish </w:t>
+        <w:t xml:space="preserve"> ReAct [5] interleaves reasoning with tool calls, Toolformer [6] teaches a model when and how to call, and tool-integration standards [7] make third-party tools discoverable over one protocol. All of this governs how an agent </w:t>
       </w:r>
       <w:r>
         <w:rPr>
@@ -743,14 +683,14 @@
           <w:i/>
           <w:sz w:val="20"/>
         </w:rPr>
-        <w:t>how</w:t>
+        <w:t>acts</w:t>
       </w:r>
       <w:r>
         <w:rPr>
           <w:rFonts w:ascii="Times New Roman" w:hAnsi="Times New Roman"/>
           <w:sz w:val="20"/>
         </w:rPr>
-        <w:t xml:space="preserve"> agents act; they do not constrain </w:t>
+        <w:t xml:space="preserve">. None of it constrains what the agent may afterwards </w:t>
       </w:r>
       <w:r>
         <w:rPr>
@@ -758,14 +698,14 @@
           <w:i/>
           <w:sz w:val="20"/>
         </w:rPr>
-        <w:t>what</w:t>
+        <w:t>say</w:t>
       </w:r>
       <w:r>
         <w:rPr>
           <w:rFonts w:ascii="Times New Roman" w:hAnsi="Times New Roman"/>
           <w:sz w:val="20"/>
         </w:rPr>
-        <w:t xml:space="preserve"> an agent may say about a tool's output. Our contract sits at that under-specified boundary.</w:t>
+        <w:t xml:space="preserve"> about a tool's output. The contract lives at exactly that unspecified boundary.</w:t>
       </w:r>
     </w:p>
     <w:p>
@@ -787,37 +727,7 @@
           <w:rFonts w:ascii="Times New Roman" w:hAnsi="Times New Roman"/>
           <w:sz w:val="20"/>
         </w:rPr>
-        <w:t xml:space="preserve"> Outlines [8] reformulates guided decoding as transitions over a finite-state machine. LMQL [9] adds declarative constraints over a typed grammar. Grammar-constrained decoding [10] guarantees grammatical validity without fine-tuning and </w:t>
-      </w:r>
-      <w:r>
-        <w:rPr>
-          <w:rFonts w:ascii="Times New Roman" w:hAnsi="Times New Roman"/>
-          <w:i/>
-          <w:sz w:val="20"/>
-        </w:rPr>
-        <w:t>explicitly supports input-dependent grammars</w:t>
-      </w:r>
-      <w:r>
-        <w:rPr>
-          <w:rFonts w:ascii="Times New Roman" w:hAnsi="Times New Roman"/>
-          <w:sz w:val="20"/>
-        </w:rPr>
-        <w:t xml:space="preserve">. Guidance [11] enforces JSON-schema and regex constraints at the token level, and provider tool-use APIs validate calls against a declared JSON schema [12]. We do not claim that varying a constraint with the input is new; [10] already does. Our setup differs in two ways: the value domain is bound specifically to a </w:t>
-      </w:r>
-      <w:r>
-        <w:rPr>
-          <w:rFonts w:ascii="Times New Roman" w:hAnsi="Times New Roman"/>
-          <w:i/>
-          <w:sz w:val="20"/>
-        </w:rPr>
-        <w:t>deterministic evidence producer</w:t>
-      </w:r>
-      <w:r>
-        <w:rPr>
-          <w:rFonts w:ascii="Times New Roman" w:hAnsi="Times New Roman"/>
-          <w:sz w:val="20"/>
-        </w:rPr>
-        <w:t>, so the constraint tracks ground-truth observations rather than task structure; and enforcement is not delegated to the decoder or provider: deterministic post-verification makes the guarantee hold even if the provider admits an out-of-enum token, which matters because decoding-time enforcement is unavailable behind commercial APIs. The combination of evidence-bound domains, claim-level value verification, completeness checking, and provider-independent enforcement, framed around a decidable faithfulness class, is, to our knowledge, not described as a contract in this literature. A complementary practical line wraps LLM calls in output validators with automatic re-asking: Guardrails AI [18] and NeMo Guardrails [19] ship this validate-and-repair loop as general-purpose toolkits. Tier B shares the loop's shape; the difference is the validator itself: decidable faithfulness against a deterministic evidence producer, with the strip-vs-flag semantics that Prop. 2 shows is forced, rather than user-authored heuristic checks.</w:t>
+        <w:t xml:space="preserve"> Outlines [8] casts guided decoding as a finite-state machine. LMQL [9] adds declarative constraints over a typed grammar. Grammar-constrained decoding [10] guarantees grammatical validity without fine-tuning, input-dependent grammars included. Guidance [11] pushes JSON-schema and regex constraints down to the token level, and provider APIs validate tool calls against a declared schema [12]. We do not claim that varying a constraint with the input is new; [10] already does it. The differences are in what the constraint is bound to and in who enforces it. Here the value domain comes from a deterministic evidence producer, so the constraint tracks ground-truth observations rather than task structure. And enforcement never leaves our own code: deterministic post-verification keeps the guarantee intact even if the provider admits an out-of-enum token, which matters because decoding-time enforcement is simply unavailable behind commercial APIs. To our knowledge, no prior work packages evidence-bound domains, claim-level value checks, completeness checking, and provider-independent enforcement as a single contract over a decidable faithfulness class. The closest practical relatives are the validate-and-reask toolkits, Guardrails AI [18] and NeMo Guardrails [19], which ship the same outer loop as general-purpose infrastructure. Tier B shares the loop's shape. The validator inside it is what differs: decidable faithfulness against a deterministic evidence producer, with the strip-vs-flag semantics that Prop. 2 shows is forced, rather than user-authored heuristic checks.</w:t>
       </w:r>
     </w:p>
     <w:p>
@@ -839,7 +749,7 @@
           <w:rFonts w:ascii="Times New Roman" w:hAnsi="Times New Roman"/>
           <w:sz w:val="20"/>
         </w:rPr>
-        <w:t xml:space="preserve"> Foundation models trained on code [3] power widely-used assistants, yet they resolve only a fraction of real-world software issues [4] and, in our informal pre-project trials, silently accepted semantically invalid training configurations. General-purpose assistants target syntactic correctness; ML-pipeline tooling must target domain-specific semantic correctness without fabricating.</w:t>
+        <w:t xml:space="preserve"> Foundation models trained on code [3] power widely used assistants, and those assistants still resolve only a fraction of real-world issues [4]. Our own informal trials before this project showed the same pattern in ML work: semantically invalid training configurations went through without comment. A pipeline assistant has to meet a different bar, semantic correctness about one concrete artifact, and it has to meet it without fabricating.</w:t>
       </w:r>
     </w:p>
     <w:p>
@@ -861,37 +771,7 @@
           <w:rFonts w:ascii="Times New Roman" w:hAnsi="Times New Roman"/>
           <w:sz w:val="20"/>
         </w:rPr>
-        <w:t xml:space="preserve"> Profiling libraries [13] have no notion of a target column; experiment trackers [14], [15] record metrics without interpreting them; automated model search [16] selects estimators without narrating </w:t>
-      </w:r>
-      <w:r>
-        <w:rPr>
-          <w:rFonts w:ascii="Times New Roman" w:hAnsi="Times New Roman"/>
-          <w:i/>
-          <w:sz w:val="20"/>
-        </w:rPr>
-        <w:t>why</w:t>
-      </w:r>
-      <w:r>
-        <w:rPr>
-          <w:rFonts w:ascii="Times New Roman" w:hAnsi="Times New Roman"/>
-          <w:sz w:val="20"/>
-        </w:rPr>
-        <w:t xml:space="preserve">. mlcompass adds a state-carrying advisory layer over the same artifacts; the contribution of </w:t>
-      </w:r>
-      <w:r>
-        <w:rPr>
-          <w:rFonts w:ascii="Times New Roman" w:hAnsi="Times New Roman"/>
-          <w:i/>
-          <w:sz w:val="20"/>
-        </w:rPr>
-        <w:t>this paper</w:t>
-      </w:r>
-      <w:r>
-        <w:rPr>
-          <w:rFonts w:ascii="Times New Roman" w:hAnsi="Times New Roman"/>
-          <w:sz w:val="20"/>
-        </w:rPr>
-        <w:t xml:space="preserve"> is the reliability contract, not the tool surface.</w:t>
+        <w:t xml:space="preserve"> Profiling libraries [13] do not know what a target column is. Experiment trackers [14], [15] record metrics without interpreting them. Automated model search [16] picks estimators without saying why. mlcompass layers a state-carrying advisory surface over the same artifacts; what this paper contributes is the reliability contract on that surface, not the tool surface itself.</w:t>
       </w:r>
     </w:p>
     <w:p>
@@ -936,22 +816,7 @@
           <w:rFonts w:ascii="Times New Roman" w:hAnsi="Times New Roman"/>
           <w:sz w:val="20"/>
         </w:rPr>
-        <w:t xml:space="preserve">We assume an honest operator and a well-behaved LLM provider: no adversarial weight poisoning, no malicious operator. The risk addressed is the model's tendency to fabricate or misreport entities and quantities under output-distribution pressure. We do </w:t>
-      </w:r>
-      <w:r>
-        <w:rPr>
-          <w:rFonts w:ascii="Times New Roman" w:hAnsi="Times New Roman"/>
-          <w:b/>
-          <w:sz w:val="20"/>
-        </w:rPr>
-        <w:t>not</w:t>
-      </w:r>
-      <w:r>
-        <w:rPr>
-          <w:rFonts w:ascii="Times New Roman" w:hAnsi="Times New Roman"/>
-          <w:sz w:val="20"/>
-        </w:rPr>
-        <w:t xml:space="preserve"> address: (i) adversarial column names in user data attempting prompt injection; (ii) provider outages; (iii) miscalibrated confidence on correctly-cited, correctly-valued evidence. Residual risks: Sec. V-E.</w:t>
+        <w:t>The setting assumes an honest operator and a well-behaved provider: no poisoned weights, no malicious user. The risk we address is the model's own tendency to fabricate or misreport entities and quantities under output-distribution pressure. Three things are explicitly out of scope: (i) adversarial column names planted in user data as prompt injection; (ii) provider outages; (iii) miscalibrated confidence on evidence that is cited and valued correctly. Residual risks are collected in Sec. V-E.</w:t>
       </w:r>
     </w:p>
     <w:p>
@@ -981,7 +846,7 @@
           <w:rFonts w:ascii="Times New Roman" w:hAnsi="Times New Roman"/>
           <w:sz w:val="20"/>
         </w:rPr>
-        <w:t xml:space="preserve">Fig. 1 shows the architecture as the contract sees it. A dashed trust boundary separates the </w:t>
+        <w:t xml:space="preserve">Fig. 1 draws the system the way the contract sees it. A dashed trust boundary splits the picture in two. On one side is everything deterministic: the pure-Python evidence producer, the evidence dictionary </w:t>
       </w:r>
       <w:r>
         <w:rPr>
@@ -989,14 +854,14 @@
           <w:i/>
           <w:sz w:val="20"/>
         </w:rPr>
-        <w:t>deterministic side</w:t>
+        <w:t>E</w:t>
       </w:r>
       <w:r>
         <w:rPr>
           <w:rFonts w:ascii="Times New Roman" w:hAnsi="Times New Roman"/>
           <w:sz w:val="20"/>
         </w:rPr>
-        <w:t xml:space="preserve"> (the pure-Python evidence producer, the evidence dictionary </w:t>
+        <w:t xml:space="preserve">, the Tier B verifier, and the user-facing output, all plain code. On the other side is the </w:t>
       </w:r>
       <w:r>
         <w:rPr>
@@ -1004,14 +869,14 @@
           <w:i/>
           <w:sz w:val="20"/>
         </w:rPr>
-        <w:t>E</w:t>
+        <w:t>LLM narrator</w:t>
       </w:r>
       <w:r>
         <w:rPr>
           <w:rFonts w:ascii="Times New Roman" w:hAnsi="Times New Roman"/>
           <w:sz w:val="20"/>
         </w:rPr>
-        <w:t xml:space="preserve">, the Tier B verifier, and the user-facing output, all plain code) from the </w:t>
+        <w:t xml:space="preserve">, which we treat as untrusted no matter who serves it. Every arrow crossing the boundary is contract traffic. Outbound, Tier A binds the tool-schema enums to </w:t>
       </w:r>
       <w:r>
         <w:rPr>
@@ -1019,29 +884,14 @@
           <w:i/>
           <w:sz w:val="20"/>
         </w:rPr>
-        <w:t>LLM narrator</w:t>
+        <w:t>E</w:t>
       </w:r>
       <w:r>
         <w:rPr>
           <w:rFonts w:ascii="Times New Roman" w:hAnsi="Times New Roman"/>
           <w:sz w:val="20"/>
         </w:rPr>
-        <w:t xml:space="preserve">, which we treat as untrusted regardless of provider. Every arrow that crosses the boundary belongs to the contract: outbound, Tier A binds the tool-schema enums to </w:t>
-      </w:r>
-      <w:r>
-        <w:rPr>
-          <w:rFonts w:ascii="Times New Roman" w:hAnsi="Times New Roman"/>
-          <w:i/>
-          <w:sz w:val="20"/>
-        </w:rPr>
-        <w:t>E</w:t>
-      </w:r>
-      <w:r>
-        <w:rPr>
-          <w:rFonts w:ascii="Times New Roman" w:hAnsi="Times New Roman"/>
-          <w:sz w:val="20"/>
-        </w:rPr>
-        <w:t xml:space="preserve"> at call time; inbound, the narrator's </w:t>
+        <w:t xml:space="preserve"> at call time. Inbound, the narrator's </w:t>
       </w:r>
       <w:r>
         <w:rPr>
@@ -1055,7 +905,7 @@
           <w:rFonts w:ascii="Times New Roman" w:hAnsi="Times New Roman"/>
           <w:sz w:val="20"/>
         </w:rPr>
-        <w:t xml:space="preserve"> output enters only through Tier B verification; on a violation, the corrective retry re-crosses the boundary with the offending items named. Nothing crosses unchecked. Inside mlcompass this boundary sits within a larger system: eleven pipeline tools exposed through a CLI, a tool-integration server [7], an autonomous agent, and editor slash commands, over a persistent project-context folder. Every surface routes through the same deterministic backend, so the contract guards the only path by which narrator output reaches a user. Because the evidence layer is deterministic and offline, every command also works without the narrator; the narrator adds explanation, and the contract makes that explanation safe.</w:t>
+        <w:t xml:space="preserve"> payload enters only through Tier B verification, and on a violation the corrective retry crosses back with the offending items named. Nothing crosses unchecked. Inside mlcompass the boundary sits within a larger system: eleven pipeline tools behind a CLI, a tool-integration server [7], an autonomous agent, and editor slash commands, all over a persistent project-context folder. Every one of those surfaces routes through the same deterministic backend, so the guarded path is the only path from narrator to user. One consequence is worth stating on its own. The evidence layer is deterministic and offline, so every command also works with the narrator absent; the narrator only adds explanation, and the contract is what makes the explanation safe to act on.</w:t>
       </w:r>
     </w:p>
     <w:p>
@@ -1109,7 +959,7 @@
           <w:rFonts w:ascii="Times New Roman" w:hAnsi="Times New Roman"/>
           <w:sz w:val="18"/>
         </w:rPr>
-        <w:t>Fig. 1. The evidence-bound contract. The dashed line marks the trust boundary between the deterministic side (plain code, trusted) and the LLM narrator (untrusted). The deterministic layer emits the evidence dictionary E; Tier A binds the tool-schema enums to E at call time; Tier B deterministically verifies entity soundness, claim values, and completeness, with corrective retry, residual stripping, and omission flagging. Only validated citations and verified claims reach the user.</w:t>
+        <w:t>Fig. 1. The evidence-bound contract. The dashed line is the trust boundary: plain code on the deterministic side (trusted), the LLM narrator on the other (untrusted). The deterministic layer emits the evidence dictionary E; Tier A binds the tool-schema enums to E at call time; Tier B verifies entity soundness, claim values, and completeness, with corrective retry, residual stripping, and omission flagging. Only validated citations and verified claims reach the user.</w:t>
       </w:r>
     </w:p>
     <w:p>
@@ -1139,7 +989,7 @@
           <w:rFonts w:ascii="Times New Roman" w:hAnsi="Times New Roman"/>
           <w:sz w:val="20"/>
         </w:rPr>
-        <w:t xml:space="preserve">We describe the contract through the automatic leakage investigation [17] triggered when an evaluation observes a suspicious metric (AUC &gt; 0.995, accuracy &gt; 0.99, or R² &gt; 0.999). The investigation is evidence-closed: the citable world is exactly the evidence dictionary </w:t>
+        <w:t xml:space="preserve">We walk through the contract as it runs in the automatic leakage investigation [17], which fires when an evaluation sees a metric that should not happen (AUC &gt; 0.995, accuracy &gt; 0.99, or R² &gt; 0.999). The task is evidence-closed by construction: the citable world is exactly the evidence dictionary </w:t>
       </w:r>
       <w:r>
         <w:rPr>
@@ -1176,7 +1026,7 @@
           <w:rFonts w:ascii="Times New Roman" w:hAnsi="Times New Roman"/>
           <w:sz w:val="20"/>
         </w:rPr>
-        <w:t xml:space="preserve"> A pure-Python module reads the predictions table and emits </w:t>
+        <w:t xml:space="preserve"> A pure-Python module reads the predictions table and assembles </w:t>
       </w:r>
       <w:r>
         <w:rPr>
@@ -1206,7 +1056,7 @@
           <w:rFonts w:ascii="Times New Roman" w:hAnsi="Times New Roman"/>
           <w:sz w:val="20"/>
         </w:rPr>
-        <w:t xml:space="preserve">, reported as max(|ρ_P|, |ρ_S|); a candidate-leak set </w:t>
+        <w:t xml:space="preserve">, reported as max(|ρ_P|, |ρ_S|); a ranked candidate-leak set </w:t>
       </w:r>
       <w:r>
         <w:rPr>
@@ -1236,7 +1086,7 @@
           <w:rFonts w:ascii="Times New Roman" w:hAnsi="Times New Roman"/>
           <w:sz w:val="20"/>
         </w:rPr>
-        <w:t xml:space="preserve"> : max(|ρ_P(c, y)|, |ρ_S(c, y)|) ≥ 0.99 }, ranked; and the perfect-match rate P(ŷ = y). Spearman is reported alongside Pearson because monotone target transforms (log y, √y, αy + β) weaken ρ_P while leaving ρ_S = 1.0; a log-target leak at ρ_P ≈ 0.94 would otherwise slip a Pearson-only filter.</w:t>
+        <w:t xml:space="preserve"> : max(|ρ_P(c, y)|, |ρ_S(c, y)|) ≥ 0.99 }; and the perfect-match rate P(ŷ = y). Reporting Spearman next to Pearson is deliberate. Monotone target transforms (log y, √y, αy + β) pull ρ_P down while ρ_S stays at 1.0, so a log-target leak sitting at ρ_P ≈ 0.94 would slide under a Pearson-only filter.</w:t>
       </w:r>
     </w:p>
     <w:p>
@@ -1273,7 +1123,7 @@
           <w:rFonts w:ascii="Times New Roman" w:hAnsi="Times New Roman"/>
           <w:sz w:val="20"/>
         </w:rPr>
-        <w:t xml:space="preserve"> with a system prompt: cite only items in </w:t>
+        <w:t xml:space="preserve"> along with a system prompt that states the rules in words: cite only items that appear in </w:t>
       </w:r>
       <w:r>
         <w:rPr>
@@ -1303,7 +1153,7 @@
           <w:rFonts w:ascii="Times New Roman" w:hAnsi="Times New Roman"/>
           <w:sz w:val="20"/>
         </w:rPr>
-        <w:t>; address the top-ranked candidate when committing to a verdict; abstain (</w:t>
+        <w:t>; address the top-ranked candidate before committing to a verdict; abstain (</w:t>
       </w:r>
       <w:r>
         <w:rPr>
@@ -1317,7 +1167,7 @@
           <w:rFonts w:ascii="Times New Roman" w:hAnsi="Times New Roman"/>
           <w:sz w:val="20"/>
         </w:rPr>
-        <w:t>) rather than guess.</w:t>
+        <w:t>) instead of guessing.</w:t>
       </w:r>
     </w:p>
     <w:p>
@@ -1339,7 +1189,7 @@
           <w:rFonts w:ascii="Times New Roman" w:hAnsi="Times New Roman"/>
           <w:sz w:val="20"/>
         </w:rPr>
-        <w:t xml:space="preserve"> The narrator answers through a </w:t>
+        <w:t xml:space="preserve"> Answers arrive through a </w:t>
       </w:r>
       <w:r>
         <w:rPr>
@@ -1410,7 +1260,7 @@
           <w:rFonts w:ascii="Times New Roman" w:hAnsi="Times New Roman"/>
           <w:sz w:val="20"/>
         </w:rPr>
-        <w:t xml:space="preserve">s generated at call time from </w:t>
+        <w:t xml:space="preserve">s built at call time from </w:t>
       </w:r>
       <w:r>
         <w:rPr>
@@ -1440,7 +1290,7 @@
           <w:rFonts w:ascii="Times New Roman" w:hAnsi="Times New Roman"/>
           <w:sz w:val="20"/>
         </w:rPr>
-        <w:t xml:space="preserve"> when the tool input returns, plain code verifies, without trusting the provider, (1) </w:t>
+        <w:t xml:space="preserve"> when the tool input comes back, plain code re-checks it without trusting anyone. (1) </w:t>
       </w:r>
       <w:r>
         <w:rPr>
@@ -1448,14 +1298,14 @@
           <w:b/>
           <w:sz w:val="20"/>
         </w:rPr>
-        <w:t>entity soundness</w:t>
+        <w:t>Entity soundness</w:t>
       </w:r>
       <w:r>
         <w:rPr>
           <w:rFonts w:ascii="Times New Roman" w:hAnsi="Times New Roman"/>
           <w:sz w:val="20"/>
         </w:rPr>
-        <w:t xml:space="preserve">: every column cited or claimed is in the evidence set; (2) </w:t>
+        <w:t xml:space="preserve">: every column cited or claimed must be in the evidence set. (2) </w:t>
       </w:r>
       <w:r>
         <w:rPr>
@@ -1463,14 +1313,14 @@
           <w:b/>
           <w:sz w:val="20"/>
         </w:rPr>
-        <w:t>value soundness</w:t>
+        <w:t>Value soundness</w:t>
       </w:r>
       <w:r>
         <w:rPr>
           <w:rFonts w:ascii="Times New Roman" w:hAnsi="Times New Roman"/>
           <w:sz w:val="20"/>
         </w:rPr>
-        <w:t xml:space="preserve">: every claim </w:t>
+        <w:t xml:space="preserve">: each claim </w:t>
       </w:r>
       <w:r>
         <w:rPr>
@@ -1484,7 +1334,7 @@
           <w:rFonts w:ascii="Times New Roman" w:hAnsi="Times New Roman"/>
           <w:sz w:val="20"/>
         </w:rPr>
-        <w:t xml:space="preserve"> matches the measured value within 0.005 (two-decimal rounding passes, misquotes fail); (3) </w:t>
+        <w:t xml:space="preserve"> must match the measured value within 0.005, so two-decimal rounding passes and a misquote fails. (3) </w:t>
       </w:r>
       <w:r>
         <w:rPr>
@@ -1492,7 +1342,7 @@
           <w:b/>
           <w:sz w:val="20"/>
         </w:rPr>
-        <w:t>completeness</w:t>
+        <w:t>Completeness</w:t>
       </w:r>
       <w:r>
         <w:rPr>
@@ -1513,7 +1363,7 @@
           <w:rFonts w:ascii="Times New Roman" w:hAnsi="Times New Roman"/>
           <w:sz w:val="20"/>
         </w:rPr>
-        <w:t xml:space="preserve"> must address the top-ranked candidate (explicit abstention is not an omission). Violations trigger a corrective retry naming the offending items (budget 2); residual unsound entities/claims are </w:t>
+        <w:t xml:space="preserve"> must address the top-ranked candidate, where an explicit abstention is not an omission. A failed check earns the narrator a corrective retry that names the offending items (budget 2). Whatever is still unsound afterwards is </w:t>
       </w:r>
       <w:r>
         <w:rPr>
@@ -1528,7 +1378,7 @@
           <w:rFonts w:ascii="Times New Roman" w:hAnsi="Times New Roman"/>
           <w:sz w:val="20"/>
         </w:rPr>
-        <w:t xml:space="preserve">; a persistent omission is </w:t>
+        <w:t xml:space="preserve">, a persistent omission is </w:t>
       </w:r>
       <w:r>
         <w:rPr>
@@ -1543,7 +1393,7 @@
           <w:rFonts w:ascii="Times New Roman" w:hAnsi="Times New Roman"/>
           <w:sz w:val="20"/>
         </w:rPr>
-        <w:t>; completeness is then re-checked after stripping, since removing an unsound claim can itself orphan the anchor.</w:t>
+        <w:t>, and completeness is re-checked after stripping, because deleting an unsound claim can itself orphan the anchor.</w:t>
       </w:r>
     </w:p>
     <w:p>
@@ -1557,7 +1407,7 @@
           <w:rFonts w:ascii="Times New Roman" w:hAnsi="Times New Roman"/>
           <w:sz w:val="20"/>
         </w:rPr>
-        <w:t>The asymmetric handling (strip vs. flag) is not an engineering preference but a structural necessity. We record it in two propositions; both are near-definitional, stated because the design leans on them:</w:t>
+        <w:t>Strip for one property, flag for the other: the asymmetry looks like a preference and is not. It is forced, and we record why in two propositions. Neither is deep. Both carry weight in the design.</w:t>
       </w:r>
     </w:p>
     <w:p>
@@ -1720,7 +1570,7 @@
           <w:rFonts w:ascii="Times New Roman" w:hAnsi="Times New Roman"/>
           <w:sz w:val="20"/>
         </w:rPr>
-        <w:t xml:space="preserve">The resulting invariant: </w:t>
+        <w:t xml:space="preserve">The invariant that results is easy to state: </w:t>
       </w:r>
       <w:r>
         <w:rPr>
@@ -1728,14 +1578,14 @@
           <w:i/>
           <w:sz w:val="20"/>
         </w:rPr>
-        <w:t>for any response the contract returns, every cited entity and every quantitative claim is present in, and equal to, the deterministic evidence, by construction, independent of the provider.</w:t>
+        <w:t>any response the contract returns cites only entities present in the deterministic evidence and quotes only values equal to it, by construction, whoever the provider is.</w:t>
       </w:r>
       <w:r>
         <w:rPr>
           <w:rFonts w:ascii="Times New Roman" w:hAnsi="Times New Roman"/>
           <w:sz w:val="20"/>
         </w:rPr>
-        <w:t xml:space="preserve"> The simplicity of each check (membership, comparison, anchor) is exactly what decidability buys, and why the guarantee can be absolute where decoding-time methods [8], [10] cannot even be applied behind commercial APIs.</w:t>
+        <w:t xml:space="preserve"> Membership, comparison, anchor. The checks are almost embarrassingly small, and that smallness is what decidability buys; it is why the guarantee can be absolute in a setting where decoding-time methods [8], [10] cannot even be attached.</w:t>
       </w:r>
     </w:p>
     <w:p>
@@ -1788,7 +1638,7 @@
           <w:rFonts w:ascii="Times New Roman" w:hAnsi="Times New Roman"/>
           <w:sz w:val="20"/>
         </w:rPr>
-        <w:t xml:space="preserve"> </w:t>
+        <w:t xml:space="preserve"> Two. The </w:t>
       </w:r>
       <w:r>
         <w:rPr>
@@ -1796,14 +1646,14 @@
           <w:i/>
           <w:sz w:val="20"/>
         </w:rPr>
-        <w:t>Synthetic:</w:t>
+        <w:t>synthetic</w:t>
       </w:r>
       <w:r>
         <w:rPr>
           <w:rFonts w:ascii="Times New Roman" w:hAnsi="Times New Roman"/>
           <w:sz w:val="20"/>
         </w:rPr>
-        <w:t xml:space="preserve"> a 1,000 × 12 regression frame with a monotone transformed leak (</w:t>
+        <w:t xml:space="preserve"> task is a 1,000 × 12 regression frame carrying a monotone transformed leak (</w:t>
       </w:r>
       <w:r>
         <w:rPr>
@@ -1831,7 +1681,7 @@
           <w:rFonts w:ascii="Times New Roman" w:hAnsi="Times New Roman"/>
           <w:sz w:val="20"/>
         </w:rPr>
-        <w:t xml:space="preserve">. </w:t>
+        <w:t xml:space="preserve">. The </w:t>
       </w:r>
       <w:r>
         <w:rPr>
@@ -1839,14 +1689,14 @@
           <w:i/>
           <w:sz w:val="20"/>
         </w:rPr>
-        <w:t>Real-data:</w:t>
+        <w:t>real-data</w:t>
       </w:r>
       <w:r>
         <w:rPr>
           <w:rFonts w:ascii="Times New Roman" w:hAnsi="Times New Roman"/>
           <w:sz w:val="20"/>
         </w:rPr>
-        <w:t xml:space="preserve"> the public Insurance Charges dataset with an injected log-of-target leak and near-perfect predictions; external column names, distributions, and shape; 7 evidence columns, anchor </w:t>
+        <w:t xml:space="preserve"> task starts from the public Insurance Charges dataset, injects a log-of-target leak, and trains to near-perfect predictions; column names, distributions, and shape are external; 7 evidence columns, anchor </w:t>
       </w:r>
       <w:r>
         <w:rPr>
@@ -1889,7 +1739,22 @@
           <w:rFonts w:ascii="Times New Roman" w:hAnsi="Times New Roman"/>
           <w:sz w:val="20"/>
         </w:rPr>
-        <w:t xml:space="preserve"> produces the evidence, so the experiment narrates the exact evidence shape the product surfaces.</w:t>
+        <w:t xml:space="preserve"> produces </w:t>
+      </w:r>
+      <w:r>
+        <w:rPr>
+          <w:rFonts w:ascii="Times New Roman" w:hAnsi="Times New Roman"/>
+          <w:i/>
+          <w:sz w:val="20"/>
+        </w:rPr>
+        <w:t>E</w:t>
+      </w:r>
+      <w:r>
+        <w:rPr>
+          <w:rFonts w:ascii="Times New Roman" w:hAnsi="Times New Roman"/>
+          <w:sz w:val="20"/>
+        </w:rPr>
+        <w:t>, so the narrator sees exactly the evidence shape the product produces in the field.</w:t>
       </w:r>
     </w:p>
     <w:p>
@@ -1919,14 +1784,14 @@
           <w:i/>
           <w:sz w:val="20"/>
         </w:rPr>
-        <w:t>L1:</w:t>
+        <w:t>L1</w:t>
       </w:r>
       <w:r>
         <w:rPr>
           <w:rFonts w:ascii="Times New Roman" w:hAnsi="Times New Roman"/>
           <w:sz w:val="20"/>
         </w:rPr>
-        <w:t xml:space="preserve"> bare prompt (requests the structured fields, states no faithfulness rule), open tool schema, no verification. </w:t>
+        <w:t xml:space="preserve"> is the floor: a bare prompt that requests the structured fields and states no faithfulness rule, an open tool schema, no verification. </w:t>
       </w:r>
       <w:r>
         <w:rPr>
@@ -1934,14 +1799,14 @@
           <w:i/>
           <w:sz w:val="20"/>
         </w:rPr>
-        <w:t>L2:</w:t>
+        <w:t>L2</w:t>
       </w:r>
       <w:r>
         <w:rPr>
           <w:rFonts w:ascii="Times New Roman" w:hAnsi="Times New Roman"/>
           <w:sz w:val="20"/>
         </w:rPr>
-        <w:t xml:space="preserve"> the strict prompt, still unenforced. </w:t>
+        <w:t xml:space="preserve"> adds the strict prompt, still unenforced. </w:t>
       </w:r>
       <w:r>
         <w:rPr>
@@ -1949,14 +1814,14 @@
           <w:i/>
           <w:sz w:val="20"/>
         </w:rPr>
-        <w:t>L3:</w:t>
+        <w:t>L3</w:t>
       </w:r>
       <w:r>
         <w:rPr>
           <w:rFonts w:ascii="Times New Roman" w:hAnsi="Times New Roman"/>
           <w:sz w:val="20"/>
         </w:rPr>
-        <w:t xml:space="preserve"> the full shipped contract (</w:t>
+        <w:t xml:space="preserve"> is the full shipped contract (</w:t>
       </w:r>
       <w:r>
         <w:rPr>
@@ -1978,14 +1843,14 @@
           <w:i/>
           <w:sz w:val="20"/>
         </w:rPr>
-        <w:t>STRESS:</w:t>
+        <w:t>STRESS</w:t>
       </w:r>
       <w:r>
         <w:rPr>
           <w:rFonts w:ascii="Times New Roman" w:hAnsi="Times New Roman"/>
           <w:sz w:val="20"/>
         </w:rPr>
-        <w:t xml:space="preserve"> the same shipped contract with the bare prompt and Tier A enums removed, so the narrator fabricates at its natural rate and every Tier B catch is observable. All runs use DeepSeek's </w:t>
+        <w:t xml:space="preserve"> is the shipped contract with the bare prompt and the Tier A enums removed, so the narrator fabricates at its natural rate and every Tier B catch becomes observable. All runs use DeepSeek's </w:t>
       </w:r>
       <w:r>
         <w:rPr>
@@ -1999,7 +1864,7 @@
           <w:rFonts w:ascii="Times New Roman" w:hAnsi="Times New Roman"/>
           <w:sz w:val="20"/>
         </w:rPr>
-        <w:t xml:space="preserve"> endpoint (OpenAI-compatible JSON-schema tool use, provider-default sampling; the name is a rolling model alias, so run dates and the harness commit pin the configuration). The provider does not document decode-time enum enforcement, and Tier B does not rely on it; our arms do not isolate Tier A's marginal contribution (Sec. V-E). Prompts, seeds, the harness, and all raw run records are in the public repository.</w:t>
+        <w:t xml:space="preserve"> endpoint (OpenAI-compatible JSON-schema tool use, provider-default sampling; the name is a rolling alias, so run dates and the harness commit pin the configuration). The provider does not document decode-time enum enforcement and Tier B does not rely on it; two diagnostic arms separate the tiers' contributions (Sec. IV-C). Prompts, seeds, the harness, and all raw run records are in the public repository.</w:t>
       </w:r>
     </w:p>
     <w:p>
@@ -2021,7 +1886,7 @@
           <w:rFonts w:ascii="Times New Roman" w:hAnsi="Times New Roman"/>
           <w:sz w:val="20"/>
         </w:rPr>
-        <w:t xml:space="preserve"> Six rule-free paraphrases of the bare instruction (terse, baseline, helpful, expert, mechanical, cautious), N = 100 each, same evidence and tool schema; only the wording varies.</w:t>
+        <w:t xml:space="preserve"> The bare instruction rewritten six ways (terse, baseline, helpful, expert, mechanical, cautious), none containing a faithfulness rule, N = 100 per variant, same evidence and tool schema. Only the wording moves.</w:t>
       </w:r>
     </w:p>
     <w:p>
@@ -2051,7 +1916,7 @@
           <w:rFonts w:ascii="Times New Roman" w:hAnsi="Times New Roman"/>
           <w:sz w:val="20"/>
         </w:rPr>
-        <w:t xml:space="preserve">Per response that reaches the user: </w:t>
+        <w:t xml:space="preserve">Three failure channels, scored on every response that reaches the user. </w:t>
       </w:r>
       <w:r>
         <w:rPr>
@@ -2059,14 +1924,14 @@
           <w:b/>
           <w:sz w:val="20"/>
         </w:rPr>
-        <w:t>entity-fabrication</w:t>
+        <w:t>Entity-fabrication</w:t>
       </w:r>
       <w:r>
         <w:rPr>
           <w:rFonts w:ascii="Times New Roman" w:hAnsi="Times New Roman"/>
           <w:sz w:val="20"/>
         </w:rPr>
-        <w:t xml:space="preserve"> (≥ 1 column, cited or claimed, outside </w:t>
+        <w:t xml:space="preserve">: at least one column, cited or claimed, outside </w:t>
       </w:r>
       <w:r>
         <w:rPr>
@@ -2081,7 +1946,7 @@
           <w:rFonts w:ascii="Times New Roman" w:hAnsi="Times New Roman"/>
           <w:sz w:val="20"/>
         </w:rPr>
-        <w:t xml:space="preserve">); </w:t>
+        <w:t xml:space="preserve">. </w:t>
       </w:r>
       <w:r>
         <w:rPr>
@@ -2089,14 +1954,14 @@
           <w:b/>
           <w:sz w:val="20"/>
         </w:rPr>
-        <w:t>value-fabrication</w:t>
+        <w:t>Value-fabrication</w:t>
       </w:r>
       <w:r>
         <w:rPr>
           <w:rFonts w:ascii="Times New Roman" w:hAnsi="Times New Roman"/>
           <w:sz w:val="20"/>
         </w:rPr>
-        <w:t xml:space="preserve"> (≥ 1 claim whose column is in </w:t>
+        <w:t xml:space="preserve">: at least one claim whose column is in </w:t>
       </w:r>
       <w:r>
         <w:rPr>
@@ -2111,7 +1976,7 @@
           <w:rFonts w:ascii="Times New Roman" w:hAnsi="Times New Roman"/>
           <w:sz w:val="20"/>
         </w:rPr>
-        <w:t xml:space="preserve"> but whose value misses by &gt; 0.005); </w:t>
+        <w:t xml:space="preserve"> but whose value is off by more than 0.005. </w:t>
       </w:r>
       <w:r>
         <w:rPr>
@@ -2119,14 +1984,14 @@
           <w:b/>
           <w:sz w:val="20"/>
         </w:rPr>
-        <w:t>critical omission</w:t>
+        <w:t>Critical omission</w:t>
       </w:r>
       <w:r>
         <w:rPr>
           <w:rFonts w:ascii="Times New Roman" w:hAnsi="Times New Roman"/>
           <w:sz w:val="20"/>
         </w:rPr>
-        <w:t xml:space="preserve"> (committed verdict that never references the anchor). Wilson 95% CIs and raw k/N throughout. For contract arms we additionally report </w:t>
+        <w:t xml:space="preserve">: a committed verdict that never references the anchor. Wilson 95% CIs and raw k/N throughout. For contract arms we also count </w:t>
       </w:r>
       <w:r>
         <w:rPr>
@@ -2141,7 +2006,7 @@
           <w:rFonts w:ascii="Times New Roman" w:hAnsi="Times New Roman"/>
           <w:sz w:val="20"/>
         </w:rPr>
-        <w:t>: responses with ≥ 1 deterministic rejection, and total rejections.</w:t>
+        <w:t>: responses with at least one deterministic rejection, plus total rejections.</w:t>
       </w:r>
     </w:p>
     <w:p>
@@ -2615,22 +2480,7 @@
           <w:rFonts w:ascii="Times New Roman" w:hAnsi="Times New Roman"/>
           <w:sz w:val="20"/>
         </w:rPr>
-        <w:t xml:space="preserve">CIs: L1 synthetic [7.79, 16.66], L1 real-data [36.82, 50.43]; all 0/200 cells [0.00, 1.88]. On the two further channels (value misquotes and critical omissions), observed violations were </w:t>
-      </w:r>
-      <w:r>
-        <w:rPr>
-          <w:rFonts w:ascii="Times New Roman" w:hAnsi="Times New Roman"/>
-          <w:b/>
-          <w:sz w:val="20"/>
-        </w:rPr>
-        <w:t>zero in every cell of both tasks</w:t>
-      </w:r>
-      <w:r>
-        <w:rPr>
-          <w:rFonts w:ascii="Times New Roman" w:hAnsi="Times New Roman"/>
-          <w:sz w:val="20"/>
-        </w:rPr>
-        <w:t xml:space="preserve"> (0/200 each): when this model emits structured claims it copies values accurately here, and the anchor is salient. We report these as boundaries, not victories (Sec. V-C).</w:t>
+        <w:t>Table I covers the entity channel. The L1 intervals are [7.79, 16.66] on the synthetic task and [36.82, 50.43] on real data; every 0/200 cell carries [0.00, 1.88]. The other two channels stayed silent everywhere: no value misquote and no critical omission in any cell of either task. We do not read the silence as a victory. This model copies numbers accurately when it commits to structured claims, and the anchor is the most salient item in the context; Sec. V-C discusses why both could change.</w:t>
       </w:r>
     </w:p>
     <w:p>
@@ -2645,29 +2495,14 @@
           <w:b/>
           <w:sz w:val="20"/>
         </w:rPr>
-        <w:t>The paraphrase sweep: prompt wording is not a defense.</w:t>
+        <w:t>Prompt wording is not a defense.</w:t>
       </w:r>
       <w:r>
         <w:rPr>
           <w:rFonts w:ascii="Times New Roman" w:hAnsi="Times New Roman"/>
           <w:sz w:val="20"/>
         </w:rPr>
-        <w:t xml:space="preserve"> Table II gives the entity-fabrication rate of six rule-free paraphrases of the same instruction on identical evidence and schema. All six variants were authored before any measurement and none was discarded. The rate spans </w:t>
-      </w:r>
-      <w:r>
-        <w:rPr>
-          <w:rFonts w:ascii="Times New Roman" w:hAnsi="Times New Roman"/>
-          <w:b/>
-          <w:sz w:val="20"/>
-        </w:rPr>
-        <w:t>1% to 100%</w:t>
-      </w:r>
-      <w:r>
-        <w:rPr>
-          <w:rFonts w:ascii="Times New Roman" w:hAnsi="Times New Roman"/>
-          <w:sz w:val="20"/>
-        </w:rPr>
-        <w:t>: a terse instruction nearly never fabricates, a "mechanical" field-listing one always does, and a helpful-assistant framing fabricates in 93% of responses. No obvious wording feature predicts the rate. A defense whose effectiveness moves two orders of magnitude under innocuous rewording cannot be certified; this is the empirical case for structural enforcement.</w:t>
+        <w:t xml:space="preserve"> Table II shows what happens to the bare rate when only the wording of the instruction changes. All six paraphrases were written before any measurement and none was discarded afterwards. The span is 1% to 100%. A terse instruction almost never fabricates. A mechanical field-listing one always does. A helpful-assistant framing lands at 93%, and no obvious feature of the wording predicts where a variant will fall. A defense that moves two orders of magnitude under innocuous rewording is not one that can be certified. That, in a single table, is the case for structural enforcement.</w:t>
       </w:r>
     </w:p>
     <w:p>
@@ -3459,59 +3294,14 @@
           <w:b/>
           <w:sz w:val="20"/>
         </w:rPr>
-        <w:t>The verifier demonstrably fires.</w:t>
+        <w:t>The verifier fires, and correction works.</w:t>
       </w:r>
       <w:r>
         <w:rPr>
           <w:rFonts w:ascii="Times New Roman" w:hAnsi="Times New Roman"/>
           <w:sz w:val="20"/>
         </w:rPr>
-        <w:t xml:space="preserve"> In the STRESS configuration on the real-data task, Tier B caught violations in </w:t>
-      </w:r>
-      <w:r>
-        <w:rPr>
-          <w:rFonts w:ascii="Times New Roman" w:hAnsi="Times New Roman"/>
-          <w:b/>
-          <w:sz w:val="20"/>
-        </w:rPr>
-        <w:t>75 of 200 responses (76 total catches)</w:t>
-      </w:r>
-      <w:r>
-        <w:rPr>
-          <w:rFonts w:ascii="Times New Roman" w:hAnsi="Times New Roman"/>
-          <w:sz w:val="20"/>
-        </w:rPr>
-        <w:t xml:space="preserve"> and passed </w:t>
-      </w:r>
-      <w:r>
-        <w:rPr>
-          <w:rFonts w:ascii="Times New Roman" w:hAnsi="Times New Roman"/>
-          <w:b/>
-          <w:sz w:val="20"/>
-        </w:rPr>
-        <w:t>zero</w:t>
-      </w:r>
-      <w:r>
-        <w:rPr>
-          <w:rFonts w:ascii="Times New Roman" w:hAnsi="Times New Roman"/>
-          <w:sz w:val="20"/>
-        </w:rPr>
-        <w:t xml:space="preserve"> to the user; on the synthetic task, 4 catches, zero passed. A pre-stated iid retry model (E[calls] = 1 + q + q², residual-strip probability q³) predicts ≈ 114 total catches at the observed first-attempt rate q = 0.375; the measured 76 rejects the iid assumption in the informative direction: retries are not independent draws, because the corrective message changes behavior. After one corrective message naming the violation, only </w:t>
-      </w:r>
-      <w:r>
-        <w:rPr>
-          <w:rFonts w:ascii="Times New Roman" w:hAnsi="Times New Roman"/>
-          <w:b/>
-          <w:sz w:val="20"/>
-        </w:rPr>
-        <w:t>1 of 75</w:t>
-      </w:r>
-      <w:r>
-        <w:rPr>
-          <w:rFonts w:ascii="Times New Roman" w:hAnsi="Times New Roman"/>
-          <w:sz w:val="20"/>
-        </w:rPr>
-        <w:t xml:space="preserve"> responses violated again: the conditional repeat rate fell from 37.5% to 1.3% (Wilson 95% CI [0.2%, 7.2%]; a ~28× drop in point estimate, ≥ ~5× at the bound), and no response reached the strip fallback. The stress configuration is not an artificial weakening: the sweep shows that wordings fabricating at up to 100% arise from innocuous paraphrases, so a rule-free narrator is an empirically occurring operating point; the stress arm instantiates that point and shows the contract absorbing it. Precise, deterministic feedback is itself a strong mitigation; the verifier is what makes the feedback precise. Expected overhead is E[calls] ≈ 1.38 even in the stress configuration and ≈ 1.0 in production (zero violations observed under the strict prompt).</w:t>
+        <w:t xml:space="preserve"> Under STRESS on the real-data task, Tier B caught violations in 75 of 200 responses (76 total catches) and passed zero of them to the user; the synthetic task added 4 catches, again none passed. Before running we wrote down an iid retry model (E[calls] = 1 + q + q², residual-strip probability q³); at the observed first-attempt rate q = 0.375 it predicts about 114 catches. We measured 76. The model is rejected, and in the direction that matters: retries are not independent draws, because the corrective message changes behavior. After one corrective message naming the violation, exactly 1 of 75 responses violated again. The conditional repeat rate fell from 37.5% to 1.3% (Wilson 95% CI [0.2%, 7.2%]), a ~28× drop in point estimate and at least ~5× at the bound, and no response ever reached the strip fallback. Is the stress arm artificial? The sweep says no: wordings that fabricate at up to 100% arise from innocuous paraphrases, so a rule-free narrator is an operating point that occurs in practice; the stress arm instantiates it and shows the contract absorbing it. There is a quieter lesson too. Precise, deterministic feedback is itself a strong mitigation, and the verifier is what makes the feedback precise. Expected overhead stays at E[calls] ≈ 1.38 even under stress, and at ≈ 1.0 in production, where the strict prompt produced no violations at all.</w:t>
       </w:r>
     </w:p>
     <w:p>
@@ -3533,7 +3323,7 @@
           <w:rFonts w:ascii="Times New Roman" w:hAnsi="Times New Roman"/>
           <w:sz w:val="20"/>
         </w:rPr>
-        <w:t xml:space="preserve"> Two further diagnostic arms (synthetic task, N = 200 each) separate the layers' contributions. With the evidence-bound enum in the schema, a bare prompt, and no verification (Tier A only), the observed rate fell from L1's 11.5% to 0/200: even on an endpoint without documented decode-time enforcement, the enum steers the model strongly; schemas act here as instructions, not just validators. Conversely, the full contract under the sweep's worst paraphrase (100/100 fabrication unenforced) produced zero first-attempt violations and therefore zero catches: the steering absorbed the worst wording outright. Neither observation is a guarantee, since steering, like prompting, can regress silently; but together with the stress arm they show each tier is independently effective in practice, while Tier B remains the only layer whose protection is certifiable.</w:t>
+        <w:t xml:space="preserve"> Two further diagnostic arms (synthetic task, N = 200 each) pull the layers apart. The first puts the evidence-bound enum in the schema over a bare prompt with no verification, Tier A alone, and the rate fell from L1's 11.5% to 0/200. Even on an endpoint with no documented decode-time enforcement, the enum steers the model strongly; a schema acts here as an instruction, not just a validator. The second runs the full contract under the sweep's worst paraphrase, the one fabricating 100/100 unenforced, and saw zero first-attempt violations and therefore zero catches: the steering absorbed the worst wording before Tier B had anything to do. Neither observation is a guarantee, since steering can regress as silently as prompting. Together with the stress arm, though, the picture is consistent: each tier is independently effective in practice, and Tier B remains the only layer whose protection is certifiable.</w:t>
       </w:r>
     </w:p>
     <w:p>
@@ -3555,7 +3345,7 @@
           <w:rFonts w:ascii="Times New Roman" w:hAnsi="Times New Roman"/>
           <w:sz w:val="20"/>
         </w:rPr>
-        <w:t xml:space="preserve"> The contract adds provider calls only on violation: one call per investigation plus at most two corrective retries; the verification itself is set membership and numeric comparison (Prop. 1). Worst case three calls; measured production overhead zero.</w:t>
+        <w:t xml:space="preserve"> Extra provider calls happen only on violation: one call per investigation plus at most two corrective retries. The verification itself is set membership and float comparison (Prop. 1). Worst case three calls; measured production overhead zero.</w:t>
       </w:r>
     </w:p>
     <w:p>
@@ -3577,7 +3367,7 @@
           <w:rFonts w:ascii="Times New Roman" w:hAnsi="Times New Roman"/>
           <w:sz w:val="20"/>
         </w:rPr>
-        <w:t xml:space="preserve"> The contract ships in the production narrator; 22 end-to-end contract tests (enum binding, value tolerance, misquote retry/strip, omission retry/flag, abstention exemption, stress configuration, both provider tool formats) run with mock clients, and the quality gates (</w:t>
+        <w:t xml:space="preserve"> Everything above is the shipped code path, not a research fork. The repository carries 23 end-to-end contract tests (enum binding, value tolerance, misquote retry and strip, omission retry and flag, abstention exemption, the stress configuration, both provider tool formats) against mock clients, and the quality gates (</w:t>
       </w:r>
       <w:r>
         <w:rPr>
@@ -3650,7 +3440,7 @@
           <w:rFonts w:ascii="Times New Roman" w:hAnsi="Times New Roman"/>
           <w:sz w:val="20"/>
         </w:rPr>
-        <w:t xml:space="preserve">The sweep makes the principle quantitative: the same model on the same evidence fabricates between 1% and 100% of the time depending on innocuous wording, and the strict prompt's observed zeros (0/200 per task) still leave a 1.88% Wilson upper bound with no structural reason to hold under the next model update or the next paraphrase. The contract provides what no prompt can: a worst-case guarantee at any propensity, under any wording. </w:t>
+        <w:t xml:space="preserve">The sweep turns a slogan into a number. One model, one evidence dictionary, and a fabrication rate anywhere between 1% and 100%, depending on harmless wording choices. The strict prompt's zeros are real (0/200 per task), and they still leave a 1.88% Wilson upper bound with nothing structural holding them in place across the next model update or the next paraphrase. The contract supplies what no prompt can: a worst-case guarantee at any propensity, under any wording. </w:t>
       </w:r>
       <w:r>
         <w:rPr>
@@ -3688,7 +3478,7 @@
           <w:rFonts w:ascii="Times New Roman" w:hAnsi="Times New Roman"/>
           <w:sz w:val="20"/>
         </w:rPr>
-        <w:t xml:space="preserve">The stress data reveal a second-order benefit: the deterministic verifier does not merely block unfaithful responses; it also names the violation, and that named feedback cut the repeat-violation rate from 37.5% to 1.3% (Sec. IV-C). Vague "be accurate" guidance is weak (the </w:t>
+        <w:t xml:space="preserve">The stress data carry a second lesson. The verifier does more than block: it names what went wrong, and that named feedback is what cut the repeat-violation rate from 37.5% to 1.3% (Sec. IV-C). Contrast the </w:t>
       </w:r>
       <w:r>
         <w:rPr>
@@ -3703,7 +3493,7 @@
           <w:rFonts w:ascii="Times New Roman" w:hAnsi="Times New Roman"/>
           <w:sz w:val="20"/>
         </w:rPr>
-        <w:t xml:space="preserve"> paraphrase fabricated at 45%); precise, machine-generated violation reports are strong. This suggests the right division of labor in narrator design: let the verifier, not the prompt author, do the correcting.</w:t>
+        <w:t xml:space="preserve"> paraphrase, which amounts to telling the model to be careful, and which fabricated at 45%. Vague guidance is weak; machine-generated violation reports are strong. The division of labor follows: let the verifier, not the prompt author, do the correcting.</w:t>
       </w:r>
     </w:p>
     <w:p>
@@ -3733,7 +3523,22 @@
           <w:rFonts w:ascii="Times New Roman" w:hAnsi="Times New Roman"/>
           <w:sz w:val="20"/>
         </w:rPr>
-        <w:t>We measured no value misquotes and no critical omissions anywhere: the numbers sit verbatim in context (copying is easy) and the anchor is the most salient item. The channels may activate under longer contexts, derived statistics, or busier evidence; the contract closes them pre-emptively at the cost of a set lookup and a float comparison (Prop. 1). Verifying cheap invariants before they are observed failing is, we argue, the right default for evidence-closed narrators.</w:t>
+        <w:t xml:space="preserve">Nothing fired on the value and omission channels anywhere. The honest explanation: the numbers sit verbatim in the context window, copying them is easy, and the anchor is the single most salient item in </w:t>
+      </w:r>
+      <w:r>
+        <w:rPr>
+          <w:rFonts w:ascii="Times New Roman" w:hAnsi="Times New Roman"/>
+          <w:i/>
+          <w:sz w:val="20"/>
+        </w:rPr>
+        <w:t>E</w:t>
+      </w:r>
+      <w:r>
+        <w:rPr>
+          <w:rFonts w:ascii="Times New Roman" w:hAnsi="Times New Roman"/>
+          <w:sz w:val="20"/>
+        </w:rPr>
+        <w:t>. Longer contexts, derived statistics, or busier evidence could activate either channel. The contract closes both pre-emptively, and the price is a set lookup and a float comparison (Prop. 1). Paying that price before a channel is observed to fail, not after, strikes us as the right default for evidence-closed narrators.</w:t>
       </w:r>
     </w:p>
     <w:p>
@@ -3763,7 +3568,7 @@
           <w:rFonts w:ascii="Times New Roman" w:hAnsi="Times New Roman"/>
           <w:sz w:val="20"/>
         </w:rPr>
-        <w:t>The contract needs three invariants: a deterministic evidence producer, a finite enumerable set of observed entities and values, and a runtime enum bound to that set with independent verification. Wherever narration is evidence-closed, the same guarantee applies: a clinical-decision narrator could bind citations to the patient's actually-measured abnormal results and verify cited values against the measurements; an expert-system narrator could bind citations to fired rule IDs. We have not evaluated these domains; they mark the boundary of the claim. A related engineering lesson from shipping the system: when one capability ships through several interfaces (CLI and tool-server in our case), behavioral parity must be enforced through shared code paths and tested as an invariant; we hit and fixed exactly such a divergence.</w:t>
+        <w:t>Three invariants make the contract portable: a deterministic evidence producer, a finite enumerable set of observed entities and values, and a runtime enum bound to that set with independent verification. Any narration task with all three supports the same guarantee. A clinical-decision narrator could be bound to the patient's actually-measured abnormal results, with cited values verified against the measurements; an expert-system narrator could be bound to the IDs of the rules that fired. We have not evaluated either domain, and they mark where our claims stop. One engineering note from shipping deserves a sentence. When a capability is exposed through several interfaces (CLI and tool-server here), parity must be enforced through shared code paths and tested as an invariant; we hit exactly such a divergence and fixed it.</w:t>
       </w:r>
     </w:p>
     <w:p>
@@ -3808,7 +3613,7 @@
           <w:rFonts w:ascii="Times New Roman" w:hAnsi="Times New Roman"/>
           <w:sz w:val="20"/>
         </w:rPr>
-        <w:t xml:space="preserve"> All measurements use one commercial LLM; the rates should not be generalized; our own sweep shows they do not even generalize across paraphrases.</w:t>
+        <w:t xml:space="preserve"> Every measurement comes from one commercial LLM. The rates should not be generalized to other models; our own sweep shows they do not even generalize across paraphrases of one prompt.</w:t>
       </w:r>
     </w:p>
     <w:p>
@@ -3837,7 +3642,7 @@
           <w:rFonts w:ascii="Times New Roman" w:hAnsi="Times New Roman"/>
           <w:sz w:val="20"/>
         </w:rPr>
-        <w:t xml:space="preserve"> Both tasks inject a log-of-target leak; diversity of leak patterns and evidence shapes remains future work. We did not log the composition of L1 violations, per-response claim counts, or per-arm abstention rates; an arm that drove the narrator into abstention would trivially score zero on all channels, though L1's high rates show the task elicits committed, citing behavior.</w:t>
+        <w:t xml:space="preserve"> Both tasks inject a log-of-target leak, and other leak patterns and evidence shapes remain unmeasured. We also did not log the composition of L1 violations, per-response claim counts, or per-arm abstention rates; an arm that pushed the narrator into abstention would trivially score zero on every channel. L1's high rates indicate the task elicits committed, citing behavior, but the logging gap is real.</w:t>
       </w:r>
     </w:p>
     <w:p>
@@ -3866,7 +3671,7 @@
           <w:rFonts w:ascii="Times New Roman" w:hAnsi="Times New Roman"/>
           <w:sz w:val="20"/>
         </w:rPr>
-        <w:t xml:space="preserve"> The stress arm reuses the shipped contract's user message, which references a contract; its first-attempt propensity is therefore not exactly comparable to L1's (synthetic: 2% vs. 11.5%; real data: 37.5% vs. 43.5%). Catches are reported as demonstrations of the verifier firing, not as estimates of the bare rate.</w:t>
+        <w:t xml:space="preserve"> The stress arm reuses the shipped contract's user message, which mentions a contract, so its first-attempt propensity is not exactly L1's (synthetic: 2% vs. 11.5%; real data: 37.5% vs. 43.5%). We report catches as demonstrations that the verifier fires, not as estimates of the bare rate.</w:t>
       </w:r>
     </w:p>
     <w:p>
@@ -3895,7 +3700,7 @@
           <w:rFonts w:ascii="Times New Roman" w:hAnsi="Times New Roman"/>
           <w:sz w:val="20"/>
         </w:rPr>
-        <w:t xml:space="preserve"> Miscalibrated confidence on correctly-cited, correctly-valued evidence; fabrication inside the free-text narration field (renderers surface the validated citation and claim sets as the actionable output); under enforcement pressure, fabrication may also migrate toward this unverified channel, and we did not measure such displacement; prompt-injection compliance. If the deterministic layer misses the true leak, the enum structurally bars the narrator from naming it, a precision-for-recall trade inherent to the binding.</w:t>
+        <w:t xml:space="preserve"> Miscalibrated confidence on correctly-cited, correctly-valued evidence is not scored. Neither is the free-text narration field (renderers surface the validated citation and claim sets as the actionable output), and enforcement pressure could in principle push fabrication into that unverified channel; we did not measure such displacement. Prompt-injection compliance is likewise open. And if the deterministic layer misses the true leak, the enum bars the narrator from naming it, a precision-for-recall trade inherent to the binding.</w:t>
       </w:r>
     </w:p>
     <w:p>
@@ -3924,7 +3729,7 @@
           <w:rFonts w:ascii="Times New Roman" w:hAnsi="Times New Roman"/>
           <w:sz w:val="20"/>
         </w:rPr>
-        <w:t xml:space="preserve"> Measured in isolation on the synthetic task only (0/200 from an 11.5% baseline), the enum demonstrably steers this endpoint, but absent decode-time enforcement it remains as uncertifiable as a prompt. No head-to-head against a static-schema decoder where decoders are applicable, nor against validate-and-reask toolkits [18], [19].</w:t>
+        <w:t xml:space="preserve"> Isolated on the synthetic task only, the enum took an 11.5% baseline to 0/200. That is steering on this endpoint, and without decode-time enforcement it stays exactly as uncertifiable as a prompt. We also ran no head-to-head against a static-schema decoder where decoders apply, nor against the validate-and-reask toolkits [18], [19].</w:t>
       </w:r>
     </w:p>
     <w:p>
@@ -3953,37 +3758,7 @@
           <w:rFonts w:ascii="Times New Roman" w:hAnsi="Times New Roman"/>
           <w:sz w:val="20"/>
         </w:rPr>
-        <w:t xml:space="preserve">We defined </w:t>
-      </w:r>
-      <w:r>
-        <w:rPr>
-          <w:rFonts w:ascii="Times New Roman" w:hAnsi="Times New Roman"/>
-          <w:i/>
-          <w:sz w:val="20"/>
-        </w:rPr>
-        <w:t>evidence-closed narration</w:t>
-      </w:r>
-      <w:r>
-        <w:rPr>
-          <w:rFonts w:ascii="Times New Roman" w:hAnsi="Times New Roman"/>
-          <w:sz w:val="20"/>
-        </w:rPr>
-        <w:t xml:space="preserve">, the class of tasks whose citable entities and verifiable quantities are finite and machine-enumerable at call time, and showed that for this class faithfulness is decidable (Prop. 1), soundness is enforceable by safe deletion while completeness is only detectable (Prop. 2), and fabrication is therefore preventable by construction. The two-tier evidence-bound contract realizing this ships in the production narrator of mlcompass and was measured live on a synthetic and a real-data leakage task: bare narrators fabricated at 11.5% and 43.5% (and anywhere from 1% to 100% across six rule-free paraphrases of the same instruction), while the contract held the user-facing rate at 0/200 on every channel of both tasks, and its deterministic verifier demonstrably caught 80 live violations in the stress configurations (76 on the real-data task), with named corrective feedback cutting repeat violations from 37.5% to 1.3%. We frame the contribution honestly: not a new decoding algorithm, but a decidable-class framing, a provider-independent contract with two formal observations, and first measurements, including the paraphrase sweep that, we believe, is the clearest quantitative argument yet that prompt-level faithfulness cannot be certified. Future work is a research program: a public narrator-fabrication benchmark across providers, tasks, and leak patterns; verified claims over derived and relational statistics; contract composition across multi-step agent chains, where each step's enum derives from the </w:t>
-      </w:r>
-      <w:r>
-        <w:rPr>
-          <w:rFonts w:ascii="Times New Roman" w:hAnsi="Times New Roman"/>
-          <w:i/>
-          <w:sz w:val="20"/>
-        </w:rPr>
-        <w:t>verified</w:t>
-      </w:r>
-      <w:r>
-        <w:rPr>
-          <w:rFonts w:ascii="Times New Roman" w:hAnsi="Times New Roman"/>
-          <w:sz w:val="20"/>
-        </w:rPr>
-        <w:t xml:space="preserve"> output of the previous one; and transposition to other evidence-closed narrators beyond ML tooling.</w:t>
+        <w:t>Evidence-closed narration names the class of tasks whose citable entities and verifiable quantities are finite and machine-enumerable at call time. For this class, faithfulness checking is linear-time (Prop. 1), soundness can be enforced by safe deletion while completeness can only be detected (Prop. 2), and fabrication is therefore preventable rather than merely mitigable. The two-tier contract built on those facts ships in the production narrator of mlcompass, and we measured it live. Bare narrators fabricated at 11.5% and 43.5% on a synthetic and a real-data leakage task, and at anywhere from 1% to 100% across six paraphrases of one instruction. The contract held the user-facing rate at 0/200 on every channel of both tasks; its verifier caught 80 violations across the stress configurations, 76 of them on real data; and one named corrective message cut repeat violations from 37.5% to 1.3%. We are explicit about what is being claimed: not a new decoding algorithm, but a decidable-class framing, a provider-independent contract with two formal observations, and first measurements, among which the paraphrase sweep is, we believe, the sharpest quantitative evidence so far that prompt-level faithfulness cannot be certified. The program ahead is concrete: a public narrator-fabrication benchmark across providers, tasks, and leak patterns; verified claims over derived and relational statistics; contract composition along multi-step agent chains, each step's enum derived from the verified output of the step before; and transposition to evidence-closed narrators beyond ML tooling.</w:t>
       </w:r>
     </w:p>
     <w:p>
@@ -4021,6 +3796,35 @@
           <w:sz w:val="20"/>
         </w:rPr>
         <w:t xml:space="preserve"> PyPI, MIT license. All prompts, seeds, the measurement harness, and raw live-run records are in the repository.</w:t>
+      </w:r>
+    </w:p>
+    <w:p>
+      <w:pPr>
+        <w:spacing w:before="160" w:after="80"/>
+        <w:ind w:firstLine="0"/>
+        <w:jc w:val="center"/>
+      </w:pPr>
+      <w:r>
+        <w:rPr>
+          <w:rFonts w:ascii="Times New Roman" w:hAnsi="Times New Roman"/>
+          <w:b/>
+          <w:sz w:val="20"/>
+        </w:rPr>
+        <w:t>ACKNOWLEDGMENT</w:t>
+      </w:r>
+    </w:p>
+    <w:p>
+      <w:pPr>
+        <w:spacing w:before="0" w:after="60"/>
+        <w:ind w:firstLine="288"/>
+        <w:jc w:val="both"/>
+      </w:pPr>
+      <w:r>
+        <w:rPr>
+          <w:rFonts w:ascii="Times New Roman" w:hAnsi="Times New Roman"/>
+          <w:sz w:val="20"/>
+        </w:rPr>
+        <w:t>The authors used a large language model as a coding and writing assistant during the development of mlcompass and the preparation of this manuscript. All experimental results come from the recorded harness runs in the public repository; the authors reviewed and verified all content and bear full responsibility for it.</w:t>
       </w:r>
     </w:p>
     <w:p>

</xml_diff>

<commit_message>
Paper: remove Acknowledgment section (authors will handle disclosure)
</commit_message>
<xml_diff>
--- a/paper/INISTA_Paper.docx
+++ b/paper/INISTA_Paper.docx
@@ -3810,35 +3810,6 @@
           <w:b/>
           <w:sz w:val="20"/>
         </w:rPr>
-        <w:t>ACKNOWLEDGMENT</w:t>
-      </w:r>
-    </w:p>
-    <w:p>
-      <w:pPr>
-        <w:spacing w:before="0" w:after="60"/>
-        <w:ind w:firstLine="288"/>
-        <w:jc w:val="both"/>
-      </w:pPr>
-      <w:r>
-        <w:rPr>
-          <w:rFonts w:ascii="Times New Roman" w:hAnsi="Times New Roman"/>
-          <w:sz w:val="20"/>
-        </w:rPr>
-        <w:t>The authors used a large language model as a coding and writing assistant during the development of mlcompass and the preparation of this manuscript. All experimental results come from the recorded harness runs in the public repository; the authors reviewed and verified all content and bear full responsibility for it.</w:t>
-      </w:r>
-    </w:p>
-    <w:p>
-      <w:pPr>
-        <w:spacing w:before="160" w:after="80"/>
-        <w:ind w:firstLine="0"/>
-        <w:jc w:val="center"/>
-      </w:pPr>
-      <w:r>
-        <w:rPr>
-          <w:rFonts w:ascii="Times New Roman" w:hAnsi="Times New Roman"/>
-          <w:b/>
-          <w:sz w:val="20"/>
-        </w:rPr>
         <w:t>REFERENCES</w:t>
       </w:r>
     </w:p>

</xml_diff>

<commit_message>
Paper: trim ~20 typeset lines to fit 6 pages
- Compress Sec II code-assistants paragraph and constrained-gen tail
- Tighten Prop 2 proof, III-B closing, stress paragraph, V-D, Limitation 4
- Fold Reproducibility section into the Artifact paragraph (URL kept)
- Drop duplicated repo sentence from Setup
- No numbers, claims, tables or citations changed
</commit_message>
<xml_diff>
--- a/paper/INISTA_Paper.docx
+++ b/paper/INISTA_Paper.docx
@@ -105,7 +105,7 @@
           <w:rFonts w:ascii="Times New Roman" w:hAnsi="Times New Roman"/>
           <w:sz w:val="20"/>
         </w:rPr>
-        <w:t xml:space="preserve">; faithfulness can therefore be checked exactly rather than estimated, and fabrication can be prevented outright instead of statistically reduced. We build the check into a two-tier </w:t>
+        <w:t xml:space="preserve">; faithfulness can therefore be checked exactly, and fabrication prevented outright rather than statistically reduced. We build the check into a two-tier </w:t>
       </w:r>
       <w:r>
         <w:rPr>
@@ -134,7 +134,7 @@
           <w:rFonts w:ascii="Times New Roman" w:hAnsi="Times New Roman"/>
           <w:sz w:val="20"/>
         </w:rPr>
-        <w:t xml:space="preserve"> domains of the tool-input schema from the evidence at call time. Tier B re-verifies the returned answer in plain code (entity soundness, claim-value soundness, completeness) with corrective retry, stripping, and flagging, and needs no trust in provider schema enforcement. Two short formal observations carry the design: verification is linear-time, and deletion repairs soundness safely while no safe repair exists for completeness. Live measurements (N = 200 per cell) back this up. Across six rule-free paraphrases of one instruction, the bare narrator fabricated on identical evidence at rates from 1% to 100%; the contract held the user-facing rate at 0/200 on all three channels of a synthetic and a real-data leakage task; under stress the verifier caught 76 live violations, passed none through, and one corrective message cut repeat violations from 37.5% to 1.3%. The contract ships in the production narrator of mlcompass, an open-source ML-pipeline assistant.</w:t>
+        <w:t xml:space="preserve"> domains of the tool-input schema from the evidence at call time. Tier B re-verifies the returned answer in plain code (entity soundness, claim-value soundness, completeness) with corrective retry, stripping, and flagging, trusting no provider enforcement. Two short formal observations carry the design: verification is linear-time, and deletion repairs soundness safely while no safe repair exists for completeness. Live measurements (N = 200 per cell) back this up. Across six rule-free paraphrases of one instruction, the bare narrator fabricated on identical evidence at rates from 1% to 100%; the contract held the user-facing rate at 0/200 on all three channels of a synthetic and a real-data leakage task; under stress the verifier caught 76 live violations, passed none through, and one corrective message cut repeat violations from 37.5% to 1.3%. The contract ships in the production narrator of mlcompass, an open-source ML-pipeline assistant.</w:t>
       </w:r>
     </w:p>
     <w:p>
@@ -187,7 +187,7 @@
           <w:rFonts w:ascii="Times New Roman" w:hAnsi="Times New Roman"/>
           <w:sz w:val="20"/>
         </w:rPr>
-        <w:t>Machine-learning practice runs on a patchwork of single-purpose tools. A profiling library inspects the dataset [13], experiment trackers log training runs [14], [15], and automated model search picks an estimator [16]. Each does one job well. None of them tells the engineer what the results mean, and the now-standard answer to that gap is agentic: put a large language model (LLM) on top, let it call the tools, read their structured output, and explain, following the pattern formalized by ReAct [5] and Toolformer [6] and operationalized by tool-integration standards [7].</w:t>
+        <w:t>Machine-learning practice runs on a patchwork of single-purpose tools. A profiling library inspects the dataset [13], experiment trackers log training runs [14], [15], and automated model search picks an estimator [16]. Each covers one slice; none tells the engineer what the results mean. The now-standard answer to that gap is agentic: put a large language model (LLM) on top, let it call the tools, read their structured output, and explain, following the pattern formalized by ReAct [5] and Toolformer [6] and operationalized by tool-integration standards [7].</w:t>
       </w:r>
     </w:p>
     <w:p>
@@ -451,7 +451,7 @@
           <w:rFonts w:ascii="Times New Roman" w:hAnsi="Times New Roman"/>
           <w:sz w:val="20"/>
         </w:rPr>
-        <w:t>. Free-text narration sits outside these channels, and renderers surface the validated fields as the actionable output. None of the checks is sophisticated, and that is the point. Decidability is what makes such simple checks sufficient (Sec. III-C), and it is why the guarantee can be absolute in a place where decoding-time machinery cannot run at all.</w:t>
+        <w:t>. Free-text narration sits outside these channels, and renderers surface the validated fields as the actionable output. None of the checks is sophisticated, and that is the point: decidability makes simple checks sufficient (Sec. III-C) and lets the guarantee be absolute where decoding-time machinery cannot run at all.</w:t>
       </w:r>
     </w:p>
     <w:p>
@@ -727,7 +727,7 @@
           <w:rFonts w:ascii="Times New Roman" w:hAnsi="Times New Roman"/>
           <w:sz w:val="20"/>
         </w:rPr>
-        <w:t xml:space="preserve"> Outlines [8] casts guided decoding as a finite-state machine. LMQL [9] adds declarative constraints over a typed grammar. Grammar-constrained decoding [10] guarantees grammatical validity without fine-tuning, input-dependent grammars included. Guidance [11] pushes JSON-schema and regex constraints down to the token level, and provider APIs validate tool calls against a declared schema [12]. We do not claim that varying a constraint with the input is new; [10] already does it. The differences are in what the constraint is bound to and in who enforces it. Here the value domain comes from a deterministic evidence producer, so the constraint tracks ground-truth observations rather than task structure. And enforcement never leaves our own code: deterministic post-verification keeps the guarantee intact even if the provider admits an out-of-enum token, which matters because decoding-time enforcement is simply unavailable behind commercial APIs. To our knowledge, no prior work packages evidence-bound domains, claim-level value checks, completeness checking, and provider-independent enforcement as a single contract over a decidable faithfulness class. The closest practical relatives are the validate-and-reask toolkits, Guardrails AI [18] and NeMo Guardrails [19], which ship the same outer loop as general-purpose infrastructure. Tier B shares the loop's shape. The validator inside it is what differs: decidable faithfulness against a deterministic evidence producer, with the strip-vs-flag semantics that Prop. 2 shows is forced, rather than user-authored heuristic checks.</w:t>
+        <w:t xml:space="preserve"> Outlines [8] casts guided decoding as a finite-state machine. LMQL [9] adds declarative constraints over a typed grammar. Grammar-constrained decoding [10] guarantees grammatical validity without fine-tuning, input-dependent grammars included. Guidance [11] pushes JSON-schema and regex constraints down to the token level, and provider APIs validate tool calls against a declared schema [12]. We do not claim that varying a constraint with the input is new; [10] already does it. The differences are in what the constraint is bound to and in who enforces it. Here the value domain comes from a deterministic evidence producer, so the constraint tracks ground-truth observations rather than task structure. And enforcement never leaves our own code: deterministic post-verification keeps the guarantee intact even if the provider admits an out-of-enum token, which matters because decoding-time enforcement is simply unavailable behind commercial APIs. To our knowledge, no prior work packages evidence-bound domains, claim-level value checks, completeness checking, and provider-independent enforcement as a single contract over a decidable faithfulness class. The closest practical relatives are the validate-and-reask toolkits Guardrails AI [18] and NeMo Guardrails [19], which ship the same outer loop as general-purpose infrastructure. Tier B shares the loop's shape; the validator inside differs: decidable faithfulness against a deterministic evidence producer, with the strip-vs-flag semantics Prop. 2 shows is forced, not user-authored heuristic checks.</w:t>
       </w:r>
     </w:p>
     <w:p>
@@ -749,7 +749,7 @@
           <w:rFonts w:ascii="Times New Roman" w:hAnsi="Times New Roman"/>
           <w:sz w:val="20"/>
         </w:rPr>
-        <w:t xml:space="preserve"> Foundation models trained on code [3] power widely used assistants, and those assistants still resolve only a fraction of real-world issues [4]. Our own informal trials before this project showed the same pattern in ML work: semantically invalid training configurations went through without comment. A pipeline assistant has to meet a different bar, semantic correctness about one concrete artifact, and it has to meet it without fabricating.</w:t>
+        <w:t xml:space="preserve"> Foundation models trained on code [3] power widely used assistants that still resolve only a fraction of real-world issues [4]; in our own informal trials they also accepted semantically invalid training configurations without comment. A pipeline assistant has to be right about one concrete artifact, and right without fabricating.</w:t>
       </w:r>
     </w:p>
     <w:p>
@@ -905,7 +905,7 @@
           <w:rFonts w:ascii="Times New Roman" w:hAnsi="Times New Roman"/>
           <w:sz w:val="20"/>
         </w:rPr>
-        <w:t xml:space="preserve"> payload enters only through Tier B verification, and on a violation the corrective retry crosses back with the offending items named. Nothing crosses unchecked. Inside mlcompass the boundary sits within a larger system: eleven pipeline tools behind a CLI, a tool-integration server [7], an autonomous agent, and editor slash commands, all over a persistent project-context folder. Every one of those surfaces routes through the same deterministic backend, so the guarded path is the only path from narrator to user. One consequence is worth stating on its own. The evidence layer is deterministic and offline, so every command also works with the narrator absent; the narrator only adds explanation, and the contract is what makes the explanation safe to act on.</w:t>
+        <w:t xml:space="preserve"> payload enters only through Tier B verification, and on a violation the corrective retry crosses back with the offending items named. Nothing crosses unchecked. Inside mlcompass the boundary sits within a larger system: eleven pipeline tools behind a CLI, a tool-integration server [7], an autonomous agent, and editor slash commands, all over a persistent project-context folder. Every one of those surfaces routes through the same deterministic backend, so the guarded path is the only path from narrator to user. And since the evidence layer is deterministic and offline, every command works with the narrator absent; the narrator only adds explanation, and the contract makes that explanation safe to act on.</w:t>
       </w:r>
     </w:p>
     <w:p>
@@ -1864,7 +1864,7 @@
           <w:rFonts w:ascii="Times New Roman" w:hAnsi="Times New Roman"/>
           <w:sz w:val="20"/>
         </w:rPr>
-        <w:t xml:space="preserve"> endpoint (OpenAI-compatible JSON-schema tool use, provider-default sampling; the name is a rolling alias, so run dates and the harness commit pin the configuration). The provider does not document decode-time enum enforcement and Tier B does not rely on it; two diagnostic arms separate the tiers' contributions (Sec. IV-C). Prompts, seeds, the harness, and all raw run records are in the public repository.</w:t>
+        <w:t xml:space="preserve"> endpoint (OpenAI-compatible JSON-schema tool use, provider-default sampling; the name is a rolling alias, so run dates and the harness commit pin the configuration). The provider does not document decode-time enum enforcement and Tier B does not rely on it; two diagnostic arms separate the tiers' contributions (Sec. IV-C).</w:t>
       </w:r>
     </w:p>
     <w:p>
@@ -3301,7 +3301,7 @@
           <w:rFonts w:ascii="Times New Roman" w:hAnsi="Times New Roman"/>
           <w:sz w:val="20"/>
         </w:rPr>
-        <w:t xml:space="preserve"> Under STRESS on the real-data task, Tier B caught violations in 75 of 200 responses (76 total catches) and passed zero of them to the user; the synthetic task added 4 catches, again none passed. Before running we wrote down an iid retry model (E[calls] = 1 + q + q², residual-strip probability q³); at the observed first-attempt rate q = 0.375 it predicts about 114 catches. We measured 76. The model is rejected, and in the direction that matters: retries are not independent draws, because the corrective message changes behavior. After one corrective message naming the violation, exactly 1 of 75 responses violated again. The conditional repeat rate fell from 37.5% to 1.3% (Wilson 95% CI [0.2%, 7.2%]), a ~28× drop in point estimate and at least ~5× at the bound, and no response ever reached the strip fallback. Is the stress arm artificial? The sweep says no: wordings that fabricate at up to 100% arise from innocuous paraphrases, so a rule-free narrator is an operating point that occurs in practice; the stress arm instantiates it and shows the contract absorbing it. There is a quieter lesson too. Precise, deterministic feedback is itself a strong mitigation, and the verifier is what makes the feedback precise. Expected overhead stays at E[calls] ≈ 1.38 even under stress, and at ≈ 1.0 in production, where the strict prompt produced no violations at all.</w:t>
+        <w:t xml:space="preserve"> Under STRESS on the real-data task, Tier B caught violations in 75 of 200 responses (76 total catches) and passed zero of them to the user; the synthetic task added 4 catches, again none passed. Before running we wrote down an iid retry model (E[calls] = 1 + q + q², residual-strip probability q³); at the observed first-attempt rate q = 0.375 it predicts about 114 catches. We measured 76. The model is rejected, and in the direction that matters: retries are not independent draws, because the corrective message changes behavior. After one corrective message naming the violation, exactly 1 of 75 responses violated again. The conditional repeat rate fell from 37.5% to 1.3% (Wilson 95% CI [0.2%, 7.2%]), a ~28× drop in point estimate and at least ~5× at the bound, and no response ever reached the strip fallback. Nor is the stress arm artificial: the sweep shows that wordings fabricating at up to 100% arise from innocuous paraphrases, so a rule-free narrator is an operating point that occurs in practice; the stress arm instantiates it and shows the contract absorbing it. A quieter lesson: precise, deterministic feedback is itself a strong mitigation, and the verifier is what makes it precise. Expected overhead stays at E[calls] ≈ 1.38 even under stress, and at ≈ 1.0 in production, where the strict prompt produced no violations at all.</w:t>
       </w:r>
     </w:p>
     <w:p>
@@ -3568,7 +3568,7 @@
           <w:rFonts w:ascii="Times New Roman" w:hAnsi="Times New Roman"/>
           <w:sz w:val="20"/>
         </w:rPr>
-        <w:t>Three invariants make the contract portable: a deterministic evidence producer, a finite enumerable set of observed entities and values, and a runtime enum bound to that set with independent verification. Any narration task with all three supports the same guarantee. A clinical-decision narrator could be bound to the patient's actually-measured abnormal results, with cited values verified against the measurements; an expert-system narrator could be bound to the IDs of the rules that fired. We have not evaluated either domain, and they mark where our claims stop. One engineering note from shipping deserves a sentence. When a capability is exposed through several interfaces (CLI and tool-server here), parity must be enforced through shared code paths and tested as an invariant; we hit exactly such a divergence and fixed it.</w:t>
+        <w:t>Three invariants make the contract portable: a deterministic evidence producer, a finite enumerable set of observed entities and values, and a runtime enum bound to that set with independent verification. Any narration task with all three supports the same guarantee. A clinical-decision narrator could be bound to the patient's actually-measured abnormal results, with cited values verified against the measurements; an expert-system narrator could be bound to the IDs of the rules that fired. We have not evaluated either domain; they mark where our claims stop. One engineering note from shipping: when a capability is exposed through several interfaces (CLI and tool-server here), parity must be enforced through shared code paths and tested as an invariant; we hit and fixed exactly such a divergence.</w:t>
       </w:r>
     </w:p>
     <w:p>
@@ -3700,7 +3700,7 @@
           <w:rFonts w:ascii="Times New Roman" w:hAnsi="Times New Roman"/>
           <w:sz w:val="20"/>
         </w:rPr>
-        <w:t xml:space="preserve"> Miscalibrated confidence on correctly-cited, correctly-valued evidence is not scored. Neither is the free-text narration field (renderers surface the validated citation and claim sets as the actionable output), and enforcement pressure could in principle push fabrication into that unverified channel; we did not measure such displacement. Prompt-injection compliance is likewise open. And if the deterministic layer misses the true leak, the enum bars the narrator from naming it, a precision-for-recall trade inherent to the binding.</w:t>
+        <w:t xml:space="preserve"> Miscalibrated confidence on correctly-cited, correctly-valued evidence is not scored, nor is the free-text narration field (renderers surface the validated citation and claim sets as the actionable output); enforcement pressure could push fabrication into that unverified channel, and we did not measure such displacement. Prompt-injection compliance is likewise open. And if the deterministic layer misses the true leak, the enum bars the narrator from naming it, a precision-for-recall trade inherent to the binding.</w:t>
       </w:r>
     </w:p>
     <w:p>

</xml_diff>

<commit_message>
Paper: scope the two strongest claims precisely
- preventable now explicitly scoped to the verified channels
- cannot-be-certified extended to: from observed compliance (contrib 3)
  and from observed behavior alone (conclusion)
- Responds to external reviewer flag on overreach; consistent with
  Limitation 4
</commit_message>
<xml_diff>
--- a/paper/INISTA_Paper.docx
+++ b/paper/INISTA_Paper.docx
@@ -572,7 +572,7 @@
           <w:rFonts w:ascii="Times New Roman" w:hAnsi="Times New Roman"/>
           <w:sz w:val="20"/>
         </w:rPr>
-        <w:t>A six-way paraphrase sweep in which the bare narrator's fabrication rate on identical evidence moves from 1% to 100% under rule-free rewording. We read this as the empirical case that prompt-level defenses cannot be certified (Sec. IV-C).</w:t>
+        <w:t>A six-way paraphrase sweep in which the bare narrator's fabrication rate on identical evidence moves from 1% to 100% under rule-free rewording. We read this as the empirical case that prompt-level defenses cannot be certified from observed compliance (Sec. IV-C).</w:t>
       </w:r>
     </w:p>
     <w:p>
@@ -3758,7 +3758,7 @@
           <w:rFonts w:ascii="Times New Roman" w:hAnsi="Times New Roman"/>
           <w:sz w:val="20"/>
         </w:rPr>
-        <w:t>Evidence-closed narration names the class of tasks whose citable entities and verifiable quantities are finite and machine-enumerable at call time. For this class, faithfulness checking is linear-time (Prop. 1), soundness can be enforced by safe deletion while completeness can only be detected (Prop. 2), and fabrication is therefore preventable rather than merely mitigable. The two-tier contract built on those facts ships in the production narrator of mlcompass, and we measured it live. Bare narrators fabricated at 11.5% and 43.5% on a synthetic and a real-data leakage task, and at anywhere from 1% to 100% across six paraphrases of one instruction. The contract held the user-facing rate at 0/200 on every channel of both tasks; its verifier caught 80 violations across the stress configurations, 76 of them on real data; and one named corrective message cut repeat violations from 37.5% to 1.3%. We are explicit about what is being claimed: not a new decoding algorithm, but a decidable-class framing, a provider-independent contract with two formal observations, and first measurements, among which the paraphrase sweep is, we believe, the sharpest quantitative evidence so far that prompt-level faithfulness cannot be certified. The program ahead is concrete: a public narrator-fabrication benchmark across providers, tasks, and leak patterns; verified claims over derived and relational statistics; contract composition along multi-step agent chains, each step's enum derived from the verified output of the step before; and transposition to evidence-closed narrators beyond ML tooling.</w:t>
+        <w:t>Evidence-closed narration names the class of tasks whose citable entities and verifiable quantities are finite and machine-enumerable at call time. For this class, faithfulness checking is linear-time (Prop. 1), soundness can be enforced by safe deletion while completeness can only be detected (Prop. 2), and fabrication on the verified channels is therefore preventable rather than merely mitigable. The two-tier contract built on those facts ships in the production narrator of mlcompass, and we measured it live. Bare narrators fabricated at 11.5% and 43.5% on a synthetic and a real-data leakage task, and at anywhere from 1% to 100% across six paraphrases of one instruction. The contract held the user-facing rate at 0/200 on every channel of both tasks; its verifier caught 80 violations across the stress configurations, 76 of them on real data; and one named corrective message cut repeat violations from 37.5% to 1.3%. We are explicit about what is being claimed: not a new decoding algorithm, but a decidable-class framing, a provider-independent contract with two formal observations, and first measurements, among which the paraphrase sweep is, we believe, the sharpest quantitative evidence so far that prompt-level faithfulness cannot be certified from observed behavior alone. The program ahead is concrete: a public narrator-fabrication benchmark across providers, tasks, and leak patterns; verified claims over derived and relational statistics; contract composition along multi-step agent chains, each step's enum derived from the verified output of the step before; and transposition to evidence-closed narrators beyond ML tooling.</w:t>
       </w:r>
     </w:p>
     <w:p>

</xml_diff>

<commit_message>
Paper: renumber references to IEEE first-citation order
Intro opened with [13]; references now follow first appearance in the
text. New order: ydata 1, mlflow 2, tensorflow 3, autosklearn 4,
react-toolformer-mcp 5-7 unchanged, ji 8, huang 9, codex 10,
swebench 11, outlines 12, lmql 13, gcd 14, guidance 15, structured 16,
leakage-guardrails-nemo 17-19 unchanged. LaTeX bibitems reordered
(cite keys untouched); md body + list renumbered by script; both
verified: first-occurrence sequence is strictly 1..19.
</commit_message>
<xml_diff>
--- a/paper/INISTA_Paper.docx
+++ b/paper/INISTA_Paper.docx
@@ -187,7 +187,7 @@
           <w:rFonts w:ascii="Times New Roman" w:hAnsi="Times New Roman"/>
           <w:sz w:val="20"/>
         </w:rPr>
-        <w:t>Machine-learning practice runs on a patchwork of single-purpose tools. A profiling library inspects the dataset [13], experiment trackers log training runs [14], [15], and automated model search picks an estimator [16]. Each covers one slice; none tells the engineer what the results mean. The now-standard answer to that gap is agentic: put a large language model (LLM) on top, let it call the tools, read their structured output, and explain, following the pattern formalized by ReAct [5] and Toolformer [6] and operationalized by tool-integration standards [7].</w:t>
+        <w:t>Machine-learning practice runs on a patchwork of single-purpose tools. A profiling library inspects the dataset [1], experiment trackers log training runs [2], [3], and automated model search picks an estimator [4]. Each covers one slice; none tells the engineer what the results mean. The now-standard answer to that gap is agentic: put a large language model (LLM) on top, let it call the tools, read their structured output, and explain, following the pattern formalized by ReAct [5] and Toolformer [6] and operationalized by tool-integration standards [7].</w:t>
       </w:r>
     </w:p>
     <w:p>
@@ -201,7 +201,7 @@
           <w:rFonts w:ascii="Times New Roman" w:hAnsi="Times New Roman"/>
           <w:sz w:val="20"/>
         </w:rPr>
-        <w:t xml:space="preserve">The trouble is that LLMs hallucinate [1], [2], and assistants built on the same foundation models [3] still fail real software tasks at substantial rates [4]. In an advisory ML setting the failure takes a specific form. The narrated object is </w:t>
+        <w:t xml:space="preserve">The trouble is that LLMs hallucinate [8], [9], and assistants built on the same foundation models [10] still fail real software tasks at substantial rates [11]. In an advisory ML setting the failure takes a specific form. The narrated object is </w:t>
       </w:r>
       <w:r>
         <w:rPr>
@@ -246,7 +246,7 @@
           <w:rFonts w:ascii="Times New Roman" w:hAnsi="Times New Roman"/>
           <w:sz w:val="20"/>
         </w:rPr>
-        <w:t xml:space="preserve"> [1] it is a closed-world faithfulness failure, extrinsic when an entity is invented and intrinsic when a quantity contradicts the source, but the source here happens to be fully enumerable. The cost is concrete. A wrong diagnosis delivered fluently is worse than no diagnosis, because the practitioner acts on it.</w:t>
+        <w:t xml:space="preserve"> [8] it is a closed-world faithfulness failure, extrinsic when an entity is invented and intrinsic when a quantity contradicts the source, but the source here happens to be fully enumerable. The cost is concrete. A wrong diagnosis delivered fluently is worse than no diagnosis, because the practitioner acts on it.</w:t>
       </w:r>
     </w:p>
     <w:p>
@@ -349,7 +349,7 @@
           <w:rFonts w:ascii="Times New Roman" w:hAnsi="Times New Roman"/>
           <w:sz w:val="20"/>
         </w:rPr>
-        <w:t>Constrained generation looks like the natural tool for this. Outlines [8], LMQL [9], grammar-constrained decoding [10], and Guidance [11] restrict what a model may emit during decoding, and provider tool-use APIs validate calls against a declared JSON schema [12]. Input-dependent grammars exist too [10]. Two things still go wrong in our setting. Decoding-time enforcement needs access to the token distribution, and commercial APIs do not expose it. A per-call schema, in turn, only helps if the provider's enforcement is trusted, and for a safety claim it should not be.</w:t>
+        <w:t>Constrained generation looks like the natural tool for this. Outlines [12], LMQL [13], grammar-constrained decoding [14], and Guidance [15] restrict what a model may emit during decoding, and provider tool-use APIs validate calls against a declared JSON schema [16]. Input-dependent grammars exist too [14]. Two things still go wrong in our setting. Decoding-time enforcement needs access to the token distribution, and commercial APIs do not expose it. A per-call schema, in turn, only helps if the provider's enforcement is trusted, and for a safety claim it should not be.</w:t>
       </w:r>
     </w:p>
     <w:p>
@@ -638,7 +638,7 @@
           <w:rFonts w:ascii="Times New Roman" w:hAnsi="Times New Roman"/>
           <w:sz w:val="20"/>
         </w:rPr>
-        <w:t xml:space="preserve"> [1] survey hallucination across generation tasks and separate intrinsic from extrinsic failures; Huang </w:t>
+        <w:t xml:space="preserve"> [8] survey hallucination across generation tasks and separate intrinsic from extrinsic failures; Huang </w:t>
       </w:r>
       <w:r>
         <w:rPr>
@@ -653,7 +653,7 @@
           <w:rFonts w:ascii="Times New Roman" w:hAnsi="Times New Roman"/>
           <w:sz w:val="20"/>
         </w:rPr>
-        <w:t xml:space="preserve"> [2] give an LLM-specific taxonomy. Phantom-entity fabrication is extrinsic, but with structure the general problem lacks: the source is a finite, machine-enumerable dictionary, so the faithfulness check is decidable rather than open-world. We eliminate this decidable slice at the tool boundary and claim nothing beyond it.</w:t>
+        <w:t xml:space="preserve"> [9] give an LLM-specific taxonomy. Phantom-entity fabrication is extrinsic, but with structure the general problem lacks: the source is a finite, machine-enumerable dictionary, so the faithfulness check is decidable rather than open-world. We eliminate this decidable slice at the tool boundary and claim nothing beyond it.</w:t>
       </w:r>
     </w:p>
     <w:p>
@@ -727,7 +727,7 @@
           <w:rFonts w:ascii="Times New Roman" w:hAnsi="Times New Roman"/>
           <w:sz w:val="20"/>
         </w:rPr>
-        <w:t xml:space="preserve"> Outlines [8] casts guided decoding as a finite-state machine. LMQL [9] adds declarative constraints over a typed grammar. Grammar-constrained decoding [10] guarantees grammatical validity without fine-tuning, input-dependent grammars included. Guidance [11] pushes JSON-schema and regex constraints down to the token level, and provider APIs validate tool calls against a declared schema [12]. We do not claim that varying a constraint with the input is new; [10] already does it. The differences are in what the constraint is bound to and in who enforces it. Here the value domain comes from a deterministic evidence producer, so the constraint tracks ground-truth observations rather than task structure. And enforcement never leaves our own code: deterministic post-verification keeps the guarantee intact even if the provider admits an out-of-enum token, which matters because decoding-time enforcement is simply unavailable behind commercial APIs. To our knowledge, no prior work packages evidence-bound domains, claim-level value checks, completeness checking, and provider-independent enforcement as a single contract over a decidable faithfulness class. The closest practical relatives are the validate-and-reask toolkits Guardrails AI [18] and NeMo Guardrails [19], which ship the same outer loop as general-purpose infrastructure. Tier B shares the loop's shape; the validator inside differs: decidable faithfulness against a deterministic evidence producer, with the strip-vs-flag semantics Prop. 2 shows is forced, not user-authored heuristic checks.</w:t>
+        <w:t xml:space="preserve"> Outlines [12] casts guided decoding as a finite-state machine. LMQL [13] adds declarative constraints over a typed grammar. Grammar-constrained decoding [14] guarantees grammatical validity without fine-tuning, input-dependent grammars included. Guidance [15] pushes JSON-schema and regex constraints down to the token level, and provider APIs validate tool calls against a declared schema [16]. We do not claim that varying a constraint with the input is new; [14] already does it. The differences are in what the constraint is bound to and in who enforces it. Here the value domain comes from a deterministic evidence producer, so the constraint tracks ground-truth observations rather than task structure. And enforcement never leaves our own code: deterministic post-verification keeps the guarantee intact even if the provider admits an out-of-enum token, which matters because decoding-time enforcement is simply unavailable behind commercial APIs. To our knowledge, no prior work packages evidence-bound domains, claim-level value checks, completeness checking, and provider-independent enforcement as a single contract over a decidable faithfulness class. The closest practical relatives are the validate-and-reask toolkits Guardrails AI [18] and NeMo Guardrails [19], which ship the same outer loop as general-purpose infrastructure. Tier B shares the loop's shape; the validator inside differs: decidable faithfulness against a deterministic evidence producer, with the strip-vs-flag semantics Prop. 2 shows is forced, not user-authored heuristic checks.</w:t>
       </w:r>
     </w:p>
     <w:p>
@@ -749,7 +749,7 @@
           <w:rFonts w:ascii="Times New Roman" w:hAnsi="Times New Roman"/>
           <w:sz w:val="20"/>
         </w:rPr>
-        <w:t xml:space="preserve"> Foundation models trained on code [3] power widely used assistants that still resolve only a fraction of real-world issues [4]; in our own informal trials they also accepted semantically invalid training configurations without comment. A pipeline assistant has to be right about one concrete artifact, and right without fabricating.</w:t>
+        <w:t xml:space="preserve"> Foundation models trained on code [10] power widely used assistants that still resolve only a fraction of real-world issues [11]; in our own informal trials they also accepted semantically invalid training configurations without comment. A pipeline assistant has to be right about one concrete artifact, and right without fabricating.</w:t>
       </w:r>
     </w:p>
     <w:p>
@@ -771,7 +771,7 @@
           <w:rFonts w:ascii="Times New Roman" w:hAnsi="Times New Roman"/>
           <w:sz w:val="20"/>
         </w:rPr>
-        <w:t xml:space="preserve"> Profiling libraries [13] do not know what a target column is. Experiment trackers [14], [15] record metrics without interpreting them. Automated model search [16] picks estimators without saying why. mlcompass layers a state-carrying advisory surface over the same artifacts; what this paper contributes is the reliability contract on that surface, not the tool surface itself.</w:t>
+        <w:t xml:space="preserve"> Profiling libraries [1] do not know what a target column is. Experiment trackers [2], [3] record metrics without interpreting them. Automated model search [4] picks estimators without saying why. mlcompass layers a state-carrying advisory surface over the same artifacts; what this paper contributes is the reliability contract on that surface, not the tool surface itself.</w:t>
       </w:r>
     </w:p>
     <w:p>
@@ -1585,7 +1585,7 @@
           <w:rFonts w:ascii="Times New Roman" w:hAnsi="Times New Roman"/>
           <w:sz w:val="20"/>
         </w:rPr>
-        <w:t xml:space="preserve"> Membership, comparison, anchor. The checks are almost embarrassingly small, and that smallness is what decidability buys; it is why the guarantee can be absolute in a setting where decoding-time methods [8], [10] cannot even be attached.</w:t>
+        <w:t xml:space="preserve"> Membership, comparison, anchor. The checks are almost embarrassingly small, and that smallness is what decidability buys; it is why the guarantee can be absolute in a setting where decoding-time methods [12], [14] cannot even be attached.</w:t>
       </w:r>
     </w:p>
     <w:p>
@@ -3824,37 +3824,7 @@
           <w:rFonts w:ascii="Times New Roman" w:hAnsi="Times New Roman"/>
           <w:sz w:val="18"/>
         </w:rPr>
-        <w:t xml:space="preserve">[1] Z. Ji </w:t>
-      </w:r>
-      <w:r>
-        <w:rPr>
-          <w:rFonts w:ascii="Times New Roman" w:hAnsi="Times New Roman"/>
-          <w:i/>
-          <w:sz w:val="18"/>
-        </w:rPr>
-        <w:t>et al.</w:t>
-      </w:r>
-      <w:r>
-        <w:rPr>
-          <w:rFonts w:ascii="Times New Roman" w:hAnsi="Times New Roman"/>
-          <w:sz w:val="18"/>
-        </w:rPr>
-        <w:t xml:space="preserve">, "Survey of hallucination in natural language generation," </w:t>
-      </w:r>
-      <w:r>
-        <w:rPr>
-          <w:rFonts w:ascii="Times New Roman" w:hAnsi="Times New Roman"/>
-          <w:i/>
-          <w:sz w:val="18"/>
-        </w:rPr>
-        <w:t>ACM Comput. Surv.</w:t>
-      </w:r>
-      <w:r>
-        <w:rPr>
-          <w:rFonts w:ascii="Times New Roman" w:hAnsi="Times New Roman"/>
-          <w:sz w:val="18"/>
-        </w:rPr>
-        <w:t>, vol. 55, no. 12, Art. 248, 2023.</w:t>
+        <w:t>[1] ydata-profiling: Automated exploratory data analysis for pandas DataFrames. [Online]. Available: https://github.com/ydataai/ydata-profiling</w:t>
       </w:r>
     </w:p>
     <w:p>
@@ -3868,7 +3838,7 @@
           <w:rFonts w:ascii="Times New Roman" w:hAnsi="Times New Roman"/>
           <w:sz w:val="18"/>
         </w:rPr>
-        <w:t xml:space="preserve">[2] L. Huang </w:t>
+        <w:t xml:space="preserve">[2] M. Zaharia </w:t>
       </w:r>
       <w:r>
         <w:rPr>
@@ -3883,7 +3853,7 @@
           <w:rFonts w:ascii="Times New Roman" w:hAnsi="Times New Roman"/>
           <w:sz w:val="18"/>
         </w:rPr>
-        <w:t xml:space="preserve">, "A survey on hallucination in large language models: Principles, taxonomy, challenges, and open questions," </w:t>
+        <w:t xml:space="preserve">, "Accelerating the machine learning lifecycle with MLflow," </w:t>
       </w:r>
       <w:r>
         <w:rPr>
@@ -3891,14 +3861,14 @@
           <w:i/>
           <w:sz w:val="18"/>
         </w:rPr>
-        <w:t>arXiv:2311.05232</w:t>
+        <w:t>IEEE Data Eng. Bull.</w:t>
       </w:r>
       <w:r>
         <w:rPr>
           <w:rFonts w:ascii="Times New Roman" w:hAnsi="Times New Roman"/>
           <w:sz w:val="18"/>
         </w:rPr>
-        <w:t>, 2023.</w:t>
+        <w:t>, vol. 41, no. 4, pp. 39–45, 2018.</w:t>
       </w:r>
     </w:p>
     <w:p>
@@ -3912,7 +3882,7 @@
           <w:rFonts w:ascii="Times New Roman" w:hAnsi="Times New Roman"/>
           <w:sz w:val="18"/>
         </w:rPr>
-        <w:t xml:space="preserve">[3] M. Chen </w:t>
+        <w:t xml:space="preserve">[3] M. Abadi </w:t>
       </w:r>
       <w:r>
         <w:rPr>
@@ -3927,7 +3897,7 @@
           <w:rFonts w:ascii="Times New Roman" w:hAnsi="Times New Roman"/>
           <w:sz w:val="18"/>
         </w:rPr>
-        <w:t xml:space="preserve">, "Evaluating large language models trained on code," </w:t>
+        <w:t xml:space="preserve">, "TensorFlow: A system for large-scale machine learning," in </w:t>
       </w:r>
       <w:r>
         <w:rPr>
@@ -3935,14 +3905,14 @@
           <w:i/>
           <w:sz w:val="18"/>
         </w:rPr>
-        <w:t>arXiv:2107.03374</w:t>
+        <w:t>Proc. USENIX Symp. Operating Syst. Design Implementation (OSDI)</w:t>
       </w:r>
       <w:r>
         <w:rPr>
           <w:rFonts w:ascii="Times New Roman" w:hAnsi="Times New Roman"/>
           <w:sz w:val="18"/>
         </w:rPr>
-        <w:t>, 2021.</w:t>
+        <w:t>, 2016, pp. 265–283.</w:t>
       </w:r>
     </w:p>
     <w:p>
@@ -3956,7 +3926,7 @@
           <w:rFonts w:ascii="Times New Roman" w:hAnsi="Times New Roman"/>
           <w:sz w:val="18"/>
         </w:rPr>
-        <w:t xml:space="preserve">[4] C. E. Jimenez </w:t>
+        <w:t xml:space="preserve">[4] M. Feurer </w:t>
       </w:r>
       <w:r>
         <w:rPr>
@@ -3971,7 +3941,7 @@
           <w:rFonts w:ascii="Times New Roman" w:hAnsi="Times New Roman"/>
           <w:sz w:val="18"/>
         </w:rPr>
-        <w:t xml:space="preserve">, "SWE-bench: Can language models resolve real-world GitHub issues?" in </w:t>
+        <w:t xml:space="preserve">, "Efficient and robust automated machine learning," in </w:t>
       </w:r>
       <w:r>
         <w:rPr>
@@ -3979,14 +3949,14 @@
           <w:i/>
           <w:sz w:val="18"/>
         </w:rPr>
-        <w:t>Proc. Int. Conf. Learn. Representations (ICLR)</w:t>
+        <w:t>Proc. Adv. Neural Inf. Process. Syst. (NeurIPS)</w:t>
       </w:r>
       <w:r>
         <w:rPr>
           <w:rFonts w:ascii="Times New Roman" w:hAnsi="Times New Roman"/>
           <w:sz w:val="18"/>
         </w:rPr>
-        <w:t>, 2024.</w:t>
+        <w:t>, 2015, pp. 2962–2970.</w:t>
       </w:r>
     </w:p>
     <w:p>
@@ -4102,7 +4072,7 @@
           <w:rFonts w:ascii="Times New Roman" w:hAnsi="Times New Roman"/>
           <w:sz w:val="18"/>
         </w:rPr>
-        <w:t xml:space="preserve">[8] B. T. Willard and R. Louf, "Efficient guided generation for large language models," </w:t>
+        <w:t xml:space="preserve">[8] Z. Ji </w:t>
       </w:r>
       <w:r>
         <w:rPr>
@@ -4110,14 +4080,29 @@
           <w:i/>
           <w:sz w:val="18"/>
         </w:rPr>
-        <w:t>arXiv:2307.09702</w:t>
+        <w:t>et al.</w:t>
       </w:r>
       <w:r>
         <w:rPr>
           <w:rFonts w:ascii="Times New Roman" w:hAnsi="Times New Roman"/>
           <w:sz w:val="18"/>
         </w:rPr>
-        <w:t>, 2023.</w:t>
+        <w:t xml:space="preserve">, "Survey of hallucination in natural language generation," </w:t>
+      </w:r>
+      <w:r>
+        <w:rPr>
+          <w:rFonts w:ascii="Times New Roman" w:hAnsi="Times New Roman"/>
+          <w:i/>
+          <w:sz w:val="18"/>
+        </w:rPr>
+        <w:t>ACM Comput. Surv.</w:t>
+      </w:r>
+      <w:r>
+        <w:rPr>
+          <w:rFonts w:ascii="Times New Roman" w:hAnsi="Times New Roman"/>
+          <w:sz w:val="18"/>
+        </w:rPr>
+        <w:t>, vol. 55, no. 12, Art. 248, 2023.</w:t>
       </w:r>
     </w:p>
     <w:p>
@@ -4131,7 +4116,7 @@
           <w:rFonts w:ascii="Times New Roman" w:hAnsi="Times New Roman"/>
           <w:sz w:val="18"/>
         </w:rPr>
-        <w:t xml:space="preserve">[9] L. Beurer-Kellner, M. Fischer, and M. Vechev, "Prompting is programming: A query language for large language models," </w:t>
+        <w:t xml:space="preserve">[9] L. Huang </w:t>
       </w:r>
       <w:r>
         <w:rPr>
@@ -4139,14 +4124,29 @@
           <w:i/>
           <w:sz w:val="18"/>
         </w:rPr>
-        <w:t>Proc. ACM Program. Lang.</w:t>
+        <w:t>et al.</w:t>
       </w:r>
       <w:r>
         <w:rPr>
           <w:rFonts w:ascii="Times New Roman" w:hAnsi="Times New Roman"/>
           <w:sz w:val="18"/>
         </w:rPr>
-        <w:t>, vol. 7, no. PLDI, pp. 1946–1969, 2023.</w:t>
+        <w:t xml:space="preserve">, "A survey on hallucination in large language models: Principles, taxonomy, challenges, and open questions," </w:t>
+      </w:r>
+      <w:r>
+        <w:rPr>
+          <w:rFonts w:ascii="Times New Roman" w:hAnsi="Times New Roman"/>
+          <w:i/>
+          <w:sz w:val="18"/>
+        </w:rPr>
+        <w:t>arXiv:2311.05232</w:t>
+      </w:r>
+      <w:r>
+        <w:rPr>
+          <w:rFonts w:ascii="Times New Roman" w:hAnsi="Times New Roman"/>
+          <w:sz w:val="18"/>
+        </w:rPr>
+        <w:t>, 2023.</w:t>
       </w:r>
     </w:p>
     <w:p>
@@ -4160,7 +4160,7 @@
           <w:rFonts w:ascii="Times New Roman" w:hAnsi="Times New Roman"/>
           <w:sz w:val="18"/>
         </w:rPr>
-        <w:t xml:space="preserve">[10] S. Geng, M. Josifoski, M. Peyrard, and R. West, "Grammar-constrained decoding for structured NLP tasks without finetuning," in </w:t>
+        <w:t xml:space="preserve">[10] M. Chen </w:t>
       </w:r>
       <w:r>
         <w:rPr>
@@ -4168,14 +4168,29 @@
           <w:i/>
           <w:sz w:val="18"/>
         </w:rPr>
-        <w:t>Proc. Conf. Empirical Methods Natural Lang. Process. (EMNLP)</w:t>
+        <w:t>et al.</w:t>
       </w:r>
       <w:r>
         <w:rPr>
           <w:rFonts w:ascii="Times New Roman" w:hAnsi="Times New Roman"/>
           <w:sz w:val="18"/>
         </w:rPr>
-        <w:t>, 2023, pp. 10932–10952.</w:t>
+        <w:t xml:space="preserve">, "Evaluating large language models trained on code," </w:t>
+      </w:r>
+      <w:r>
+        <w:rPr>
+          <w:rFonts w:ascii="Times New Roman" w:hAnsi="Times New Roman"/>
+          <w:i/>
+          <w:sz w:val="18"/>
+        </w:rPr>
+        <w:t>arXiv:2107.03374</w:t>
+      </w:r>
+      <w:r>
+        <w:rPr>
+          <w:rFonts w:ascii="Times New Roman" w:hAnsi="Times New Roman"/>
+          <w:sz w:val="18"/>
+        </w:rPr>
+        <w:t>, 2021.</w:t>
       </w:r>
     </w:p>
     <w:p>
@@ -4189,7 +4204,37 @@
           <w:rFonts w:ascii="Times New Roman" w:hAnsi="Times New Roman"/>
           <w:sz w:val="18"/>
         </w:rPr>
-        <w:t>[11] Guidance: A guidance language for controlling large language models, 2023. [Online]. Available: https://github.com/guidance-ai/guidance</w:t>
+        <w:t xml:space="preserve">[11] C. E. Jimenez </w:t>
+      </w:r>
+      <w:r>
+        <w:rPr>
+          <w:rFonts w:ascii="Times New Roman" w:hAnsi="Times New Roman"/>
+          <w:i/>
+          <w:sz w:val="18"/>
+        </w:rPr>
+        <w:t>et al.</w:t>
+      </w:r>
+      <w:r>
+        <w:rPr>
+          <w:rFonts w:ascii="Times New Roman" w:hAnsi="Times New Roman"/>
+          <w:sz w:val="18"/>
+        </w:rPr>
+        <w:t xml:space="preserve">, "SWE-bench: Can language models resolve real-world GitHub issues?" in </w:t>
+      </w:r>
+      <w:r>
+        <w:rPr>
+          <w:rFonts w:ascii="Times New Roman" w:hAnsi="Times New Roman"/>
+          <w:i/>
+          <w:sz w:val="18"/>
+        </w:rPr>
+        <w:t>Proc. Int. Conf. Learn. Representations (ICLR)</w:t>
+      </w:r>
+      <w:r>
+        <w:rPr>
+          <w:rFonts w:ascii="Times New Roman" w:hAnsi="Times New Roman"/>
+          <w:sz w:val="18"/>
+        </w:rPr>
+        <w:t>, 2024.</w:t>
       </w:r>
     </w:p>
     <w:p>
@@ -4203,7 +4248,22 @@
           <w:rFonts w:ascii="Times New Roman" w:hAnsi="Times New Roman"/>
           <w:sz w:val="18"/>
         </w:rPr>
-        <w:t>[12] Structured outputs for schema-constrained tool use, 2024. [Online]. Available: https://platform.openai.com/docs/guides/structured-outputs</w:t>
+        <w:t xml:space="preserve">[12] B. T. Willard and R. Louf, "Efficient guided generation for large language models," </w:t>
+      </w:r>
+      <w:r>
+        <w:rPr>
+          <w:rFonts w:ascii="Times New Roman" w:hAnsi="Times New Roman"/>
+          <w:i/>
+          <w:sz w:val="18"/>
+        </w:rPr>
+        <w:t>arXiv:2307.09702</w:t>
+      </w:r>
+      <w:r>
+        <w:rPr>
+          <w:rFonts w:ascii="Times New Roman" w:hAnsi="Times New Roman"/>
+          <w:sz w:val="18"/>
+        </w:rPr>
+        <w:t>, 2023.</w:t>
       </w:r>
     </w:p>
     <w:p>
@@ -4217,7 +4277,22 @@
           <w:rFonts w:ascii="Times New Roman" w:hAnsi="Times New Roman"/>
           <w:sz w:val="18"/>
         </w:rPr>
-        <w:t>[13] ydata-profiling: Automated exploratory data analysis for pandas DataFrames. [Online]. Available: https://github.com/ydataai/ydata-profiling</w:t>
+        <w:t xml:space="preserve">[13] L. Beurer-Kellner, M. Fischer, and M. Vechev, "Prompting is programming: A query language for large language models," </w:t>
+      </w:r>
+      <w:r>
+        <w:rPr>
+          <w:rFonts w:ascii="Times New Roman" w:hAnsi="Times New Roman"/>
+          <w:i/>
+          <w:sz w:val="18"/>
+        </w:rPr>
+        <w:t>Proc. ACM Program. Lang.</w:t>
+      </w:r>
+      <w:r>
+        <w:rPr>
+          <w:rFonts w:ascii="Times New Roman" w:hAnsi="Times New Roman"/>
+          <w:sz w:val="18"/>
+        </w:rPr>
+        <w:t>, vol. 7, no. PLDI, pp. 1946–1969, 2023.</w:t>
       </w:r>
     </w:p>
     <w:p>
@@ -4231,7 +4306,7 @@
           <w:rFonts w:ascii="Times New Roman" w:hAnsi="Times New Roman"/>
           <w:sz w:val="18"/>
         </w:rPr>
-        <w:t xml:space="preserve">[14] M. Zaharia </w:t>
+        <w:t xml:space="preserve">[14] S. Geng, M. Josifoski, M. Peyrard, and R. West, "Grammar-constrained decoding for structured NLP tasks without finetuning," in </w:t>
       </w:r>
       <w:r>
         <w:rPr>
@@ -4239,29 +4314,14 @@
           <w:i/>
           <w:sz w:val="18"/>
         </w:rPr>
-        <w:t>et al.</w:t>
+        <w:t>Proc. Conf. Empirical Methods Natural Lang. Process. (EMNLP)</w:t>
       </w:r>
       <w:r>
         <w:rPr>
           <w:rFonts w:ascii="Times New Roman" w:hAnsi="Times New Roman"/>
           <w:sz w:val="18"/>
         </w:rPr>
-        <w:t xml:space="preserve">, "Accelerating the machine learning lifecycle with MLflow," </w:t>
-      </w:r>
-      <w:r>
-        <w:rPr>
-          <w:rFonts w:ascii="Times New Roman" w:hAnsi="Times New Roman"/>
-          <w:i/>
-          <w:sz w:val="18"/>
-        </w:rPr>
-        <w:t>IEEE Data Eng. Bull.</w:t>
-      </w:r>
-      <w:r>
-        <w:rPr>
-          <w:rFonts w:ascii="Times New Roman" w:hAnsi="Times New Roman"/>
-          <w:sz w:val="18"/>
-        </w:rPr>
-        <w:t>, vol. 41, no. 4, pp. 39–45, 2018.</w:t>
+        <w:t>, 2023, pp. 10932–10952.</w:t>
       </w:r>
     </w:p>
     <w:p>
@@ -4275,37 +4335,7 @@
           <w:rFonts w:ascii="Times New Roman" w:hAnsi="Times New Roman"/>
           <w:sz w:val="18"/>
         </w:rPr>
-        <w:t xml:space="preserve">[15] M. Abadi </w:t>
-      </w:r>
-      <w:r>
-        <w:rPr>
-          <w:rFonts w:ascii="Times New Roman" w:hAnsi="Times New Roman"/>
-          <w:i/>
-          <w:sz w:val="18"/>
-        </w:rPr>
-        <w:t>et al.</w:t>
-      </w:r>
-      <w:r>
-        <w:rPr>
-          <w:rFonts w:ascii="Times New Roman" w:hAnsi="Times New Roman"/>
-          <w:sz w:val="18"/>
-        </w:rPr>
-        <w:t xml:space="preserve">, "TensorFlow: A system for large-scale machine learning," in </w:t>
-      </w:r>
-      <w:r>
-        <w:rPr>
-          <w:rFonts w:ascii="Times New Roman" w:hAnsi="Times New Roman"/>
-          <w:i/>
-          <w:sz w:val="18"/>
-        </w:rPr>
-        <w:t>Proc. USENIX Symp. Operating Syst. Design Implementation (OSDI)</w:t>
-      </w:r>
-      <w:r>
-        <w:rPr>
-          <w:rFonts w:ascii="Times New Roman" w:hAnsi="Times New Roman"/>
-          <w:sz w:val="18"/>
-        </w:rPr>
-        <w:t>, 2016, pp. 265–283.</w:t>
+        <w:t>[15] Guidance: A guidance language for controlling large language models, 2023. [Online]. Available: https://github.com/guidance-ai/guidance</w:t>
       </w:r>
     </w:p>
     <w:p>
@@ -4319,37 +4349,7 @@
           <w:rFonts w:ascii="Times New Roman" w:hAnsi="Times New Roman"/>
           <w:sz w:val="18"/>
         </w:rPr>
-        <w:t xml:space="preserve">[16] M. Feurer </w:t>
-      </w:r>
-      <w:r>
-        <w:rPr>
-          <w:rFonts w:ascii="Times New Roman" w:hAnsi="Times New Roman"/>
-          <w:i/>
-          <w:sz w:val="18"/>
-        </w:rPr>
-        <w:t>et al.</w:t>
-      </w:r>
-      <w:r>
-        <w:rPr>
-          <w:rFonts w:ascii="Times New Roman" w:hAnsi="Times New Roman"/>
-          <w:sz w:val="18"/>
-        </w:rPr>
-        <w:t xml:space="preserve">, "Efficient and robust automated machine learning," in </w:t>
-      </w:r>
-      <w:r>
-        <w:rPr>
-          <w:rFonts w:ascii="Times New Roman" w:hAnsi="Times New Roman"/>
-          <w:i/>
-          <w:sz w:val="18"/>
-        </w:rPr>
-        <w:t>Proc. Adv. Neural Inf. Process. Syst. (NeurIPS)</w:t>
-      </w:r>
-      <w:r>
-        <w:rPr>
-          <w:rFonts w:ascii="Times New Roman" w:hAnsi="Times New Roman"/>
-          <w:sz w:val="18"/>
-        </w:rPr>
-        <w:t>, 2015, pp. 2962–2970.</w:t>
+        <w:t>[16] Structured outputs for schema-constrained tool use, 2024. [Online]. Available: https://platform.openai.com/docs/guides/structured-outputs</w:t>
       </w:r>
     </w:p>
     <w:p>

</xml_diff>